<commit_message>
Module/Internal Requirements and Victor Revision
Victor revised: Product Perspective and added definitions for Users and IT Users.
</commit_message>
<xml_diff>
--- a/SRS_Communications.docx
+++ b/SRS_Communications.docx
@@ -230,11 +230,13 @@
               <w:pStyle w:val="TableText"/>
               <w:rPr>
                 <w:color w:val="000000"/>
+                <w:u w:val="single"/>
               </w:rPr>
             </w:pPr>
             <w:r>
               <w:rPr>
                 <w:color w:val="000000"/>
+                <w:u w:val="single"/>
               </w:rPr>
               <w:t>02/10/2026</w:t>
             </w:r>
@@ -664,6 +666,13 @@
                 <w:u w:val="single"/>
               </w:rPr>
             </w:pPr>
+            <w:r>
+              <w:rPr>
+                <w:color w:val="000000"/>
+                <w:u w:val="single"/>
+              </w:rPr>
+              <w:t>02/26/2026</w:t>
+            </w:r>
           </w:p>
         </w:tc>
         <w:tc>
@@ -684,6 +693,12 @@
                 <w:color w:val="000000"/>
               </w:rPr>
             </w:pPr>
+            <w:r>
+              <w:rPr>
+                <w:color w:val="000000"/>
+              </w:rPr>
+              <w:t>1.22</w:t>
+            </w:r>
           </w:p>
         </w:tc>
         <w:tc>
@@ -699,11 +714,16 @@
           <w:p>
             <w:pPr>
               <w:pStyle w:val="TableText"/>
-              <w:snapToGrid w:val="0"/>
               <w:rPr>
                 <w:color w:val="000000"/>
               </w:rPr>
             </w:pPr>
+            <w:r>
+              <w:rPr>
+                <w:color w:val="000000"/>
+              </w:rPr>
+              <w:t>Specific Requirements (3.1.2, 3.1.3,3.1.4) and Internal Interface Requirements</w:t>
+            </w:r>
           </w:p>
         </w:tc>
         <w:tc>
@@ -717,6 +737,23 @@
             </w:tcBorders>
             <w:shd w:val="clear" w:color="auto" w:fill="E5E5E5"/>
           </w:tcPr>
+          <w:p>
+            <w:pPr>
+              <w:pStyle w:val="TableText"/>
+              <w:snapToGrid w:val="0"/>
+              <w:rPr>
+                <w:color w:val="000000"/>
+                <w:lang w:bidi="hi-IN"/>
+              </w:rPr>
+            </w:pPr>
+            <w:r>
+              <w:rPr>
+                <w:color w:val="000000" w:themeColor="text1"/>
+                <w:lang w:bidi="hi-IN"/>
+              </w:rPr>
+              <w:t xml:space="preserve">Olalekan Faniran-Ajiwe </w:t>
+            </w:r>
+          </w:p>
           <w:p>
             <w:pPr>
               <w:pStyle w:val="TableText"/>
@@ -2975,28 +3012,8 @@
       </w:pPr>
       <w:bookmarkStart w:id="4" w:name="__RefHeading___Toc19440721"/>
       <w:bookmarkEnd w:id="4"/>
-      <w:commentRangeStart w:id="5"/>
-      <w:commentRangeStart w:id="6"/>
       <w:r>
         <w:t>Definitions, Acronyms, Abbreviations</w:t>
-      </w:r>
-      <w:commentRangeEnd w:id="5"/>
-      <w:r>
-        <w:rPr>
-          <w:rStyle w:val="CommentReference"/>
-          <w:sz w:val="24"/>
-          <w:szCs w:val="20"/>
-        </w:rPr>
-        <w:commentReference w:id="5"/>
-      </w:r>
-      <w:commentRangeEnd w:id="6"/>
-      <w:r>
-        <w:rPr>
-          <w:rStyle w:val="CommentReference"/>
-          <w:sz w:val="24"/>
-          <w:szCs w:val="20"/>
-        </w:rPr>
-        <w:commentReference w:id="6"/>
       </w:r>
     </w:p>
     <w:p>
@@ -3077,7 +3094,31 @@
         <w:rPr>
           <w:color w:val="000000" w:themeColor="text1"/>
         </w:rPr>
-        <w:t>Chat history between users is persistent regardless if users are online or offline.</w:t>
+        <w:t xml:space="preserve">Chat history between users is persistent </w:t>
+      </w:r>
+      <w:r>
+        <w:rPr>
+          <w:color w:val="000000" w:themeColor="text1"/>
+        </w:rPr>
+        <w:t>regardless of</w:t>
+      </w:r>
+      <w:r>
+        <w:rPr>
+          <w:color w:val="000000" w:themeColor="text1"/>
+        </w:rPr>
+        <w:t xml:space="preserve"> </w:t>
+      </w:r>
+      <w:r>
+        <w:rPr>
+          <w:color w:val="000000" w:themeColor="text1"/>
+        </w:rPr>
+        <w:t>whether</w:t>
+      </w:r>
+      <w:r>
+        <w:rPr>
+          <w:color w:val="000000" w:themeColor="text1"/>
+        </w:rPr>
+        <w:t xml:space="preserve"> users are online or offline.</w:t>
       </w:r>
     </w:p>
     <w:p>
@@ -3101,6 +3142,98 @@
           <w:color w:val="000000" w:themeColor="text1"/>
         </w:rPr>
         <w:t>: The user manual for utilizing the Java GUI Client.</w:t>
+      </w:r>
+    </w:p>
+    <w:p>
+      <w:pPr>
+        <w:pStyle w:val="Paragraph3"/>
+        <w:ind w:left="1440"/>
+        <w:rPr>
+          <w:color w:val="000000" w:themeColor="text1"/>
+        </w:rPr>
+      </w:pPr>
+    </w:p>
+    <w:p>
+      <w:pPr>
+        <w:pStyle w:val="Paragraph3"/>
+        <w:ind w:left="1440"/>
+        <w:rPr>
+          <w:color w:val="000000" w:themeColor="text1"/>
+        </w:rPr>
+      </w:pPr>
+      <w:r>
+        <w:rPr>
+          <w:b/>
+          <w:bCs/>
+          <w:color w:val="000000" w:themeColor="text1"/>
+        </w:rPr>
+        <w:t xml:space="preserve">User: </w:t>
+      </w:r>
+      <w:r>
+        <w:rPr>
+          <w:color w:val="000000" w:themeColor="text1"/>
+        </w:rPr>
+        <w:t xml:space="preserve">An established actor that has the privileges to engage or request communication between other </w:t>
+      </w:r>
+      <w:r>
+        <w:rPr>
+          <w:color w:val="000000" w:themeColor="text1"/>
+        </w:rPr>
+        <w:t>actors</w:t>
+      </w:r>
+      <w:r>
+        <w:rPr>
+          <w:color w:val="000000" w:themeColor="text1"/>
+        </w:rPr>
+        <w:t>.</w:t>
+      </w:r>
+    </w:p>
+    <w:p>
+      <w:pPr>
+        <w:pStyle w:val="Paragraph3"/>
+        <w:ind w:left="1440"/>
+        <w:rPr>
+          <w:color w:val="000000" w:themeColor="text1"/>
+        </w:rPr>
+      </w:pPr>
+    </w:p>
+    <w:p>
+      <w:pPr>
+        <w:pStyle w:val="Paragraph3"/>
+        <w:ind w:left="1440"/>
+        <w:rPr>
+          <w:b/>
+          <w:bCs/>
+          <w:color w:val="000000" w:themeColor="text1"/>
+        </w:rPr>
+      </w:pPr>
+      <w:r>
+        <w:rPr>
+          <w:b/>
+          <w:bCs/>
+          <w:color w:val="000000" w:themeColor="text1"/>
+        </w:rPr>
+        <w:t>IT User</w:t>
+      </w:r>
+      <w:r>
+        <w:rPr>
+          <w:b/>
+          <w:bCs/>
+          <w:color w:val="000000" w:themeColor="text1"/>
+        </w:rPr>
+        <w:t xml:space="preserve">: </w:t>
+      </w:r>
+      <w:r>
+        <w:rPr>
+          <w:color w:val="000000" w:themeColor="text1"/>
+        </w:rPr>
+        <w:t>An</w:t>
+      </w:r>
+      <w:r>
+        <w:rPr>
+          <w:color w:val="000000" w:themeColor="text1"/>
+        </w:rPr>
+        <w:t xml:space="preserve"> elevated actor with system privileges that is able to monitor conversations, help users establish credentials, and interact with server-side interfaces.</w:t>
       </w:r>
     </w:p>
     <w:p>
@@ -3129,10 +3262,11 @@
           <w:numId w:val="2"/>
         </w:numPr>
       </w:pPr>
-      <w:bookmarkStart w:id="7" w:name="__RefHeading___Toc19440722"/>
-      <w:bookmarkEnd w:id="7"/>
+      <w:bookmarkStart w:id="5" w:name="__RefHeading___Toc19440722"/>
+      <w:bookmarkEnd w:id="5"/>
+      <w:commentRangeStart w:id="6"/>
+      <w:commentRangeStart w:id="7"/>
       <w:commentRangeStart w:id="8"/>
-      <w:commentRangeStart w:id="9"/>
       <w:r>
         <w:t>References</w:t>
       </w:r>
@@ -3145,8 +3279,8 @@
           <w:color w:val="7030A0"/>
         </w:rPr>
       </w:pPr>
-      <w:bookmarkStart w:id="10" w:name="__RefHeading___Toc19440723"/>
-      <w:bookmarkEnd w:id="10"/>
+      <w:bookmarkStart w:id="9" w:name="__RefHeading___Toc19440723"/>
+      <w:bookmarkEnd w:id="9"/>
       <w:r>
         <w:rPr>
           <w:rFonts w:ascii="Calibri" w:hAnsi="Calibri" w:cs="Calibri"/>
@@ -3215,7 +3349,7 @@
         </w:rPr>
         <w:t>Sequence Diagrams – Step 6 in assignment description</w:t>
       </w:r>
-      <w:commentRangeEnd w:id="8"/>
+      <w:commentRangeEnd w:id="6"/>
       <w:r>
         <w:rPr>
           <w:rStyle w:val="CommentReference"/>
@@ -3224,9 +3358,9 @@
           <w:sz w:val="20"/>
           <w:szCs w:val="20"/>
         </w:rPr>
-        <w:commentReference w:id="8"/>
-      </w:r>
-      <w:commentRangeEnd w:id="9"/>
+        <w:commentReference w:id="6"/>
+      </w:r>
+      <w:commentRangeEnd w:id="7"/>
       <w:r>
         <w:rPr>
           <w:rStyle w:val="CommentReference"/>
@@ -3235,7 +3369,18 @@
           <w:sz w:val="20"/>
           <w:szCs w:val="20"/>
         </w:rPr>
-        <w:commentReference w:id="9"/>
+        <w:commentReference w:id="7"/>
+      </w:r>
+      <w:commentRangeEnd w:id="8"/>
+      <w:r>
+        <w:rPr>
+          <w:rStyle w:val="CommentReference"/>
+          <w:rFonts w:ascii="Calibri" w:hAnsi="Calibri" w:cs="Calibri"/>
+          <w:color w:val="7030A0"/>
+          <w:sz w:val="20"/>
+          <w:szCs w:val="20"/>
+        </w:rPr>
+        <w:commentReference w:id="8"/>
       </w:r>
     </w:p>
     <w:p>
@@ -3261,8 +3406,8 @@
           <w:szCs w:val="20"/>
         </w:rPr>
       </w:pPr>
-      <w:bookmarkStart w:id="11" w:name="__RefHeading___Toc19440724"/>
-      <w:bookmarkEnd w:id="11"/>
+      <w:bookmarkStart w:id="10" w:name="__RefHeading___Toc19440724"/>
+      <w:bookmarkEnd w:id="10"/>
       <w:r>
         <w:rPr>
           <w:color w:val="000000" w:themeColor="text1"/>
@@ -3293,31 +3438,11 @@
           <w:numId w:val="2"/>
         </w:numPr>
       </w:pPr>
-      <w:bookmarkStart w:id="12" w:name="__RefHeading___Toc19440725"/>
-      <w:bookmarkEnd w:id="12"/>
-      <w:commentRangeStart w:id="13"/>
-      <w:commentRangeStart w:id="14"/>
+      <w:bookmarkStart w:id="11" w:name="__RefHeading___Toc19440725"/>
+      <w:bookmarkEnd w:id="11"/>
       <w:r>
         <w:t>Product Perspective</w:t>
       </w:r>
-      <w:commentRangeEnd w:id="13"/>
-      <w:r>
-        <w:rPr>
-          <w:rStyle w:val="CommentReference"/>
-          <w:sz w:val="24"/>
-          <w:szCs w:val="20"/>
-        </w:rPr>
-        <w:commentReference w:id="13"/>
-      </w:r>
-      <w:commentRangeEnd w:id="14"/>
-      <w:r>
-        <w:rPr>
-          <w:rStyle w:val="CommentReference"/>
-          <w:sz w:val="24"/>
-          <w:szCs w:val="20"/>
-        </w:rPr>
-        <w:commentReference w:id="14"/>
-      </w:r>
     </w:p>
     <w:p>
       <w:pPr>
@@ -3331,6 +3456,19 @@
       </w:r>
       <w:r>
         <w:t xml:space="preserve">or as large as an enterprise, Harmony is there to ensure a seamless, fast, and secure experience. Being hosted in Java, a leading programming language that beats out C++ or Python in sheer resource management, competitors are simply out of the question. </w:t>
+      </w:r>
+    </w:p>
+    <w:p>
+      <w:pPr>
+        <w:ind w:left="1440"/>
+      </w:pPr>
+    </w:p>
+    <w:p>
+      <w:pPr>
+        <w:ind w:left="1440"/>
+      </w:pPr>
+      <w:r>
+        <w:t>Our multi-system communication application will provide ap platform that is suitable not just for large enterprise companies to use but for small ambitious teams as well. These applications offer the flexibility of one-on-one communication in addition to group conversations, which brings that flexibility that other company communications lack. In addition to help boost the productivity, communication, and engagement of the team. All of this is created through the power of Java, which has been a strong leader in overall sheer resource management compared to other used languages like C++ and Python.</w:t>
       </w:r>
     </w:p>
     <w:p>
@@ -3341,33 +3479,10 @@
           <w:numId w:val="2"/>
         </w:numPr>
       </w:pPr>
-      <w:bookmarkStart w:id="15" w:name="__RefHeading___Toc19440726"/>
-      <w:bookmarkEnd w:id="15"/>
-      <w:commentRangeStart w:id="16"/>
-      <w:commentRangeStart w:id="17"/>
-      <w:r>
-        <w:t>Product Archit</w:t>
-      </w:r>
-      <w:commentRangeEnd w:id="16"/>
-      <w:r>
-        <w:rPr>
-          <w:rStyle w:val="CommentReference"/>
-          <w:sz w:val="24"/>
-          <w:szCs w:val="20"/>
-        </w:rPr>
-        <w:commentReference w:id="16"/>
-      </w:r>
-      <w:commentRangeEnd w:id="17"/>
-      <w:r>
-        <w:rPr>
-          <w:rStyle w:val="CommentReference"/>
-          <w:sz w:val="24"/>
-          <w:szCs w:val="20"/>
-        </w:rPr>
-        <w:commentReference w:id="17"/>
-      </w:r>
-      <w:r>
-        <w:t>ecture</w:t>
+      <w:bookmarkStart w:id="12" w:name="__RefHeading___Toc19440726"/>
+      <w:bookmarkEnd w:id="12"/>
+      <w:r>
+        <w:t>Product Architecture</w:t>
       </w:r>
     </w:p>
     <w:p>
@@ -3744,31 +3859,11 @@
           <w:numId w:val="2"/>
         </w:numPr>
       </w:pPr>
-      <w:bookmarkStart w:id="18" w:name="__RefHeading___Toc19440727"/>
-      <w:bookmarkEnd w:id="18"/>
-      <w:commentRangeStart w:id="19"/>
-      <w:commentRangeStart w:id="20"/>
+      <w:bookmarkStart w:id="13" w:name="__RefHeading___Toc19440727"/>
+      <w:bookmarkEnd w:id="13"/>
       <w:r>
         <w:t>Product Functionality/Features</w:t>
       </w:r>
-      <w:commentRangeEnd w:id="19"/>
-      <w:r>
-        <w:rPr>
-          <w:rStyle w:val="CommentReference"/>
-          <w:sz w:val="24"/>
-          <w:szCs w:val="20"/>
-        </w:rPr>
-        <w:commentReference w:id="19"/>
-      </w:r>
-      <w:commentRangeEnd w:id="20"/>
-      <w:r>
-        <w:rPr>
-          <w:rStyle w:val="CommentReference"/>
-          <w:sz w:val="24"/>
-          <w:szCs w:val="20"/>
-        </w:rPr>
-        <w:commentReference w:id="20"/>
-      </w:r>
     </w:p>
     <w:p>
       <w:pPr>
@@ -3812,6 +3907,7 @@
         <w:ind w:left="1440"/>
       </w:pPr>
       <w:r>
+        <w:lastRenderedPageBreak/>
         <w:t>2.3.2</w:t>
       </w:r>
     </w:p>
@@ -3996,7 +4092,19 @@
         <w:rPr>
           <w:color w:val="000000" w:themeColor="text1"/>
         </w:rPr>
-        <w:t>The message box supports conventional text modification, i.e. copy and paste, redo and undo.</w:t>
+        <w:t xml:space="preserve">The message box supports conventional text modification, </w:t>
+      </w:r>
+      <w:r>
+        <w:rPr>
+          <w:color w:val="000000" w:themeColor="text1"/>
+        </w:rPr>
+        <w:t>i.e.,</w:t>
+      </w:r>
+      <w:r>
+        <w:rPr>
+          <w:color w:val="000000" w:themeColor="text1"/>
+        </w:rPr>
+        <w:t xml:space="preserve"> copy and paste, redo and undo.</w:t>
       </w:r>
     </w:p>
     <w:p>
@@ -4032,7 +4140,19 @@
         <w:rPr>
           <w:color w:val="000000" w:themeColor="text1"/>
         </w:rPr>
-        <w:t>Users will be able to search for other users to either individually chat or form a group with.</w:t>
+        <w:t xml:space="preserve">Users will be able to search for other users to either </w:t>
+      </w:r>
+      <w:r>
+        <w:rPr>
+          <w:color w:val="000000" w:themeColor="text1"/>
+        </w:rPr>
+        <w:t>chat individually</w:t>
+      </w:r>
+      <w:r>
+        <w:rPr>
+          <w:color w:val="000000" w:themeColor="text1"/>
+        </w:rPr>
+        <w:t xml:space="preserve"> or form a group with.</w:t>
       </w:r>
     </w:p>
     <w:p>
@@ -4077,8 +4197,8 @@
           <w:numId w:val="2"/>
         </w:numPr>
       </w:pPr>
-      <w:bookmarkStart w:id="21" w:name="__RefHeading___Toc19440728"/>
-      <w:bookmarkEnd w:id="21"/>
+      <w:bookmarkStart w:id="14" w:name="__RefHeading___Toc19440728"/>
+      <w:bookmarkEnd w:id="14"/>
       <w:r>
         <w:t>Constraints</w:t>
       </w:r>
@@ -4211,6 +4331,7 @@
         <w:rPr>
           <w:color w:val="000000" w:themeColor="text1"/>
         </w:rPr>
+        <w:lastRenderedPageBreak/>
         <w:t>The application may only be programmed in Java.</w:t>
       </w:r>
     </w:p>
@@ -4283,7 +4404,6 @@
         <w:rPr>
           <w:color w:val="000000" w:themeColor="text1"/>
         </w:rPr>
-        <w:lastRenderedPageBreak/>
         <w:t xml:space="preserve">The application’s hard deadline is 05/05/2026. </w:t>
       </w:r>
     </w:p>
@@ -4763,10 +4883,9 @@
           <w:numId w:val="2"/>
         </w:numPr>
       </w:pPr>
-      <w:bookmarkStart w:id="22" w:name="__RefHeading___Toc19440729"/>
-      <w:bookmarkEnd w:id="22"/>
-      <w:r>
-        <w:lastRenderedPageBreak/>
+      <w:bookmarkStart w:id="15" w:name="__RefHeading___Toc19440729"/>
+      <w:bookmarkEnd w:id="15"/>
+      <w:r>
         <w:t>Assumptions and Dependencies</w:t>
       </w:r>
     </w:p>
@@ -5052,8 +5171,8 @@
           <w:numId w:val="2"/>
         </w:numPr>
       </w:pPr>
-      <w:bookmarkStart w:id="23" w:name="__RefHeading___Toc19440730"/>
-      <w:bookmarkEnd w:id="23"/>
+      <w:bookmarkStart w:id="16" w:name="__RefHeading___Toc19440730"/>
+      <w:bookmarkEnd w:id="16"/>
       <w:r>
         <w:lastRenderedPageBreak/>
         <w:t>Specific Requirements</w:t>
@@ -5067,8 +5186,8 @@
           <w:numId w:val="2"/>
         </w:numPr>
       </w:pPr>
-      <w:bookmarkStart w:id="24" w:name="__RefHeading___Toc19440731"/>
-      <w:bookmarkEnd w:id="24"/>
+      <w:bookmarkStart w:id="17" w:name="__RefHeading___Toc19440731"/>
+      <w:bookmarkEnd w:id="17"/>
       <w:r>
         <w:t>Functional Requirements</w:t>
       </w:r>
@@ -5471,75 +5590,245 @@
         </w:numPr>
       </w:pPr>
       <w:r>
-        <w:t>Client</w:t>
-      </w:r>
-      <w:r>
-        <w:t xml:space="preserve"> Module Requirements:</w:t>
-      </w:r>
-    </w:p>
-    <w:p>
-      <w:pPr>
-        <w:pStyle w:val="Paragraph2"/>
-        <w:rPr>
-          <w:color w:val="7030A0"/>
-        </w:rPr>
-      </w:pPr>
-      <w:bookmarkStart w:id="25" w:name="REQBV1F34"/>
-      <w:r>
-        <w:rPr>
-          <w:color w:val="7030A0"/>
-        </w:rPr>
-        <w:t xml:space="preserve">Provide module specific requirements as appropriate. </w:t>
-      </w:r>
-      <w:r>
-        <w:rPr>
-          <w:vanish/>
-          <w:color w:val="7030A0"/>
-        </w:rPr>
-        <w:t xml:space="preserve">SR10 </w:t>
-      </w:r>
-      <w:bookmarkEnd w:id="25"/>
-    </w:p>
-    <w:p>
-      <w:pPr>
-        <w:pStyle w:val="Paragraph2"/>
-        <w:rPr>
-          <w:color w:val="7030A0"/>
-        </w:rPr>
-      </w:pPr>
-      <w:r>
-        <w:rPr>
-          <w:color w:val="7030A0"/>
-        </w:rPr>
-        <w:t>Example:</w:t>
-      </w:r>
-    </w:p>
-    <w:p>
-      <w:pPr>
-        <w:pStyle w:val="Paragraph2"/>
-        <w:rPr>
-          <w:color w:val="7030A0"/>
-        </w:rPr>
-      </w:pPr>
-      <w:r>
-        <w:rPr>
-          <w:color w:val="7030A0"/>
-        </w:rPr>
-        <w:t xml:space="preserve">3.1.2.1 </w:t>
-      </w:r>
-      <w:r>
-        <w:rPr>
-          <w:vanish/>
-          <w:color w:val="7030A0"/>
-        </w:rPr>
-        <w:t xml:space="preserve">SR9 </w:t>
-      </w:r>
-      <w:r>
-        <w:rPr>
-          <w:color w:val="7030A0"/>
-        </w:rPr>
-        <w:t>Users should be allowed to log in using their issued id and pin, both of which are alphanumeric strings between 6 and 20 characters in length. </w:t>
-      </w:r>
+        <w:t>Client Module Requirements:</w:t>
+      </w:r>
+    </w:p>
+    <w:p>
+      <w:pPr>
+        <w:ind w:left="1440"/>
+      </w:pPr>
+    </w:p>
+    <w:p>
+      <w:pPr>
+        <w:ind w:left="1440"/>
+      </w:pPr>
+      <w:r>
+        <w:t>3.1.2.1</w:t>
+      </w:r>
+    </w:p>
+    <w:p>
+      <w:pPr>
+        <w:pStyle w:val="Paragraph2"/>
+        <w:rPr>
+          <w:color w:val="000000" w:themeColor="text1"/>
+        </w:rPr>
+      </w:pPr>
+      <w:r>
+        <w:rPr>
+          <w:color w:val="000000" w:themeColor="text1"/>
+        </w:rPr>
+        <w:t xml:space="preserve">Users must log in using a unique username and password, both of which are alphanumeric strings between 3 and 20 characters in length. </w:t>
+      </w:r>
+    </w:p>
+    <w:p>
+      <w:pPr>
+        <w:pStyle w:val="Paragraph2"/>
+        <w:rPr>
+          <w:color w:val="000000" w:themeColor="text1"/>
+        </w:rPr>
+      </w:pPr>
+    </w:p>
+    <w:p>
+      <w:pPr>
+        <w:ind w:left="1440"/>
+      </w:pPr>
+      <w:r>
+        <w:t>3.1.2.</w:t>
+      </w:r>
+      <w:r>
+        <w:t>2</w:t>
+      </w:r>
+    </w:p>
+    <w:p>
+      <w:pPr>
+        <w:pStyle w:val="Paragraph2"/>
+        <w:rPr>
+          <w:color w:val="000000" w:themeColor="text1"/>
+        </w:rPr>
+      </w:pPr>
+      <w:r>
+        <w:rPr>
+          <w:color w:val="000000" w:themeColor="text1"/>
+        </w:rPr>
+        <w:t>Must display a scrollable conversation history showing all sent and received messages with timestamps and sender labels for each message.</w:t>
+      </w:r>
+    </w:p>
+    <w:p>
+      <w:pPr>
+        <w:pStyle w:val="Paragraph2"/>
+        <w:rPr>
+          <w:color w:val="000000" w:themeColor="text1"/>
+        </w:rPr>
+      </w:pPr>
+    </w:p>
+    <w:p>
+      <w:pPr>
+        <w:ind w:left="1440"/>
+      </w:pPr>
+      <w:r>
+        <w:t>3.1.2.</w:t>
+      </w:r>
+      <w:r>
+        <w:t>3</w:t>
+      </w:r>
+    </w:p>
+    <w:p>
+      <w:pPr>
+        <w:pStyle w:val="Paragraph2"/>
+        <w:rPr>
+          <w:color w:val="000000" w:themeColor="text1"/>
+        </w:rPr>
+      </w:pPr>
+      <w:r>
+        <w:rPr>
+          <w:color w:val="000000" w:themeColor="text1"/>
+        </w:rPr>
+        <w:t xml:space="preserve"> The client must provide a text input field and send a button for composing and transmitting text-based messages to selected recipients.</w:t>
+      </w:r>
+    </w:p>
+    <w:p>
+      <w:pPr>
+        <w:pStyle w:val="Paragraph2"/>
+        <w:rPr>
+          <w:color w:val="000000" w:themeColor="text1"/>
+        </w:rPr>
+      </w:pPr>
+    </w:p>
+    <w:p>
+      <w:pPr>
+        <w:ind w:left="1440"/>
+      </w:pPr>
+      <w:r>
+        <w:t>3.1.2.</w:t>
+      </w:r>
+      <w:r>
+        <w:t>4</w:t>
+      </w:r>
+    </w:p>
+    <w:p>
+      <w:pPr>
+        <w:pStyle w:val="Paragraph2"/>
+        <w:rPr>
+          <w:color w:val="000000" w:themeColor="text1"/>
+        </w:rPr>
+      </w:pPr>
+      <w:r>
+        <w:rPr>
+          <w:color w:val="000000" w:themeColor="text1"/>
+        </w:rPr>
+        <w:t>The client must display a contact's panel showing available users and existing chats, allowing users to select contacts for private messaging or group invitations.</w:t>
+      </w:r>
+    </w:p>
+    <w:p>
+      <w:pPr>
+        <w:pStyle w:val="Paragraph2"/>
+        <w:rPr>
+          <w:color w:val="000000" w:themeColor="text1"/>
+        </w:rPr>
+      </w:pPr>
+    </w:p>
+    <w:p>
+      <w:pPr>
+        <w:ind w:left="1440"/>
+      </w:pPr>
+      <w:r>
+        <w:t>3.1.2.</w:t>
+      </w:r>
+      <w:r>
+        <w:t>5</w:t>
+      </w:r>
+    </w:p>
+    <w:p>
+      <w:pPr>
+        <w:pStyle w:val="Paragraph2"/>
+        <w:rPr>
+          <w:color w:val="000000" w:themeColor="text1"/>
+        </w:rPr>
+      </w:pPr>
+      <w:r>
+        <w:rPr>
+          <w:color w:val="000000" w:themeColor="text1"/>
+        </w:rPr>
+        <w:t>Include a search feature allowing users to find other registered users by entering partial usernames, with matching results displayed for selection.</w:t>
+      </w:r>
+    </w:p>
+    <w:p>
+      <w:pPr>
+        <w:pStyle w:val="Paragraph2"/>
+        <w:ind w:left="0"/>
+        <w:rPr>
+          <w:color w:val="000000" w:themeColor="text1"/>
+        </w:rPr>
+      </w:pPr>
+    </w:p>
+    <w:p>
+      <w:pPr>
+        <w:ind w:left="1440"/>
+      </w:pPr>
+      <w:r>
+        <w:t>3.1.2</w:t>
+      </w:r>
+      <w:r>
+        <w:t>.6</w:t>
+      </w:r>
+    </w:p>
+    <w:p>
+      <w:pPr>
+        <w:pStyle w:val="Paragraph2"/>
+        <w:rPr>
+          <w:color w:val="000000" w:themeColor="text1"/>
+        </w:rPr>
+      </w:pPr>
+      <w:r>
+        <w:rPr>
+          <w:color w:val="000000" w:themeColor="text1"/>
+        </w:rPr>
+        <w:t>The client must provide an accessible Help Page from the main menu describing login procedures, sending messages, group chat management, and application restrictions.</w:t>
+      </w:r>
+    </w:p>
+    <w:p>
+      <w:pPr>
+        <w:pStyle w:val="Paragraph2"/>
+        <w:rPr>
+          <w:color w:val="000000" w:themeColor="text1"/>
+        </w:rPr>
+      </w:pPr>
+    </w:p>
+    <w:p>
+      <w:pPr>
+        <w:pStyle w:val="Paragraph2"/>
+        <w:rPr>
+          <w:color w:val="000000" w:themeColor="text1"/>
+        </w:rPr>
+      </w:pPr>
+      <w:r>
+        <w:rPr>
+          <w:color w:val="000000" w:themeColor="text1"/>
+        </w:rPr>
+        <w:t>3.1.2.7</w:t>
+      </w:r>
+    </w:p>
+    <w:p>
+      <w:pPr>
+        <w:pStyle w:val="Paragraph2"/>
+        <w:rPr>
+          <w:color w:val="000000" w:themeColor="text1"/>
+        </w:rPr>
+      </w:pPr>
+      <w:r>
+        <w:rPr>
+          <w:color w:val="000000" w:themeColor="text1"/>
+        </w:rPr>
+        <w:t>The client must support conventional text editing features, including copy, paste, undo, and redo within the message area.</w:t>
+      </w:r>
+    </w:p>
+    <w:p>
+      <w:pPr>
+        <w:pStyle w:val="Paragraph2"/>
+        <w:rPr>
+          <w:color w:val="000000" w:themeColor="text1"/>
+        </w:rPr>
+      </w:pPr>
     </w:p>
     <w:p>
       <w:pPr>
@@ -5550,7 +5839,142 @@
         </w:numPr>
       </w:pPr>
       <w:r>
-        <w:t>Server</w:t>
+        <w:t>Server Module Requirements:</w:t>
+      </w:r>
+    </w:p>
+    <w:p/>
+    <w:p>
+      <w:pPr>
+        <w:ind w:left="1440"/>
+      </w:pPr>
+      <w:r>
+        <w:t>3.1.3.1</w:t>
+      </w:r>
+    </w:p>
+    <w:p>
+      <w:pPr>
+        <w:ind w:left="1440"/>
+      </w:pPr>
+      <w:r>
+        <w:t>The server must log all login attempts, with timestamps and usernames for security monitoring.</w:t>
+      </w:r>
+    </w:p>
+    <w:p>
+      <w:pPr>
+        <w:ind w:left="1440"/>
+      </w:pPr>
+    </w:p>
+    <w:p>
+      <w:pPr>
+        <w:ind w:left="1440"/>
+      </w:pPr>
+      <w:r>
+        <w:t>3.1.3.2</w:t>
+      </w:r>
+    </w:p>
+    <w:p>
+      <w:pPr>
+        <w:ind w:left="1440"/>
+      </w:pPr>
+      <w:r>
+        <w:t>The server must process user registration requests from IT clients by creating new user records with unique usernames and storing them persistently in the user database.</w:t>
+      </w:r>
+    </w:p>
+    <w:p>
+      <w:pPr>
+        <w:ind w:left="1440"/>
+      </w:pPr>
+    </w:p>
+    <w:p>
+      <w:pPr>
+        <w:ind w:left="1440"/>
+      </w:pPr>
+      <w:r>
+        <w:t>3.1.3.3</w:t>
+      </w:r>
+    </w:p>
+    <w:p>
+      <w:pPr>
+        <w:ind w:left="1440"/>
+      </w:pPr>
+      <w:r>
+        <w:t>The server must authenticate users by validating credentials against the stored user database before granting access to messaging features.</w:t>
+      </w:r>
+    </w:p>
+    <w:p>
+      <w:pPr>
+        <w:ind w:left="1440"/>
+      </w:pPr>
+      <w:r>
+        <w:lastRenderedPageBreak/>
+        <w:t>3.1.3.4</w:t>
+      </w:r>
+    </w:p>
+    <w:p>
+      <w:pPr>
+        <w:ind w:left="1440"/>
+      </w:pPr>
+      <w:r>
+        <w:t>The server must process user registration requests from IT clients and create new user accounts with unique usernames.</w:t>
+      </w:r>
+    </w:p>
+    <w:p>
+      <w:pPr>
+        <w:ind w:left="1440"/>
+      </w:pPr>
+    </w:p>
+    <w:p>
+      <w:pPr>
+        <w:ind w:left="1440"/>
+      </w:pPr>
+      <w:r>
+        <w:t>3.1.3.5</w:t>
+      </w:r>
+    </w:p>
+    <w:p>
+      <w:pPr>
+        <w:ind w:left="1440"/>
+      </w:pPr>
+      <w:r>
+        <w:t>The server must provide a console interface for server administrators to monitor active connections and system status.</w:t>
+      </w:r>
+    </w:p>
+    <w:p>
+      <w:pPr>
+        <w:ind w:left="1440"/>
+      </w:pPr>
+    </w:p>
+    <w:p>
+      <w:pPr>
+        <w:ind w:left="1440"/>
+      </w:pPr>
+      <w:r>
+        <w:t>3.1.3.6</w:t>
+      </w:r>
+    </w:p>
+    <w:p>
+      <w:pPr>
+        <w:ind w:left="1440"/>
+      </w:pPr>
+      <w:r>
+        <w:t>The server must maintain group chat functionality, including group creation, member management, and message broadcasting to all group members.</w:t>
+      </w:r>
+    </w:p>
+    <w:p>
+      <w:pPr>
+        <w:ind w:left="1440"/>
+      </w:pPr>
+    </w:p>
+    <w:p>
+      <w:pPr>
+        <w:pStyle w:val="Heading3"/>
+        <w:numPr>
+          <w:ilvl w:val="2"/>
+          <w:numId w:val="2"/>
+        </w:numPr>
+      </w:pPr>
+      <w:r>
+        <w:t>IT</w:t>
       </w:r>
       <w:r>
         <w:t xml:space="preserve"> Module Requirements:</w:t>
@@ -5558,75 +5982,148 @@
     </w:p>
     <w:p>
       <w:pPr>
-        <w:pStyle w:val="Paragraph2"/>
-        <w:rPr>
-          <w:b/>
-          <w:bCs/>
-        </w:rPr>
-      </w:pPr>
-      <w:bookmarkStart w:id="26" w:name="REQBV2F75"/>
-      <w:r>
-        <w:rPr>
-          <w:color w:val="7030A0"/>
-        </w:rPr>
-        <w:t xml:space="preserve">Provide module specific requirements as appropriate. </w:t>
-      </w:r>
-      <w:r>
-        <w:rPr>
-          <w:vanish/>
-          <w:color w:val="7030A0"/>
-        </w:rPr>
-        <w:t xml:space="preserve">SR10 </w:t>
-      </w:r>
-      <w:bookmarkEnd w:id="26"/>
-      <w:r>
-        <w:rPr>
-          <w:b/>
-          <w:bCs/>
-        </w:rPr>
-        <w:tab/>
-      </w:r>
-    </w:p>
-    <w:p>
-      <w:pPr>
-        <w:pStyle w:val="Paragraph2"/>
-        <w:rPr>
-          <w:color w:val="7030A0"/>
-        </w:rPr>
-      </w:pPr>
-      <w:r>
-        <w:rPr>
-          <w:color w:val="7030A0"/>
-        </w:rPr>
-        <w:t>Example:</w:t>
-      </w:r>
-    </w:p>
-    <w:p>
-      <w:pPr>
-        <w:pStyle w:val="Paragraph2"/>
-        <w:rPr>
-          <w:color w:val="7030A0"/>
-        </w:rPr>
-      </w:pPr>
-      <w:r>
-        <w:rPr>
-          <w:color w:val="7030A0"/>
-        </w:rPr>
-        <w:t xml:space="preserve">3.1.2.1 </w:t>
-      </w:r>
-      <w:r>
-        <w:rPr>
-          <w:vanish/>
-          <w:color w:val="7030A0"/>
-        </w:rPr>
-        <w:t xml:space="preserve">SR9 </w:t>
-      </w:r>
-      <w:r>
-        <w:rPr>
-          <w:color w:val="7030A0"/>
-        </w:rPr>
-        <w:t>Users should be allowed to log in using their issued id and pin, both of which are alphanumeric strings between 6 and 20 characters in length. </w:t>
-      </w:r>
+        <w:ind w:left="1440"/>
+      </w:pPr>
+    </w:p>
+    <w:p>
+      <w:pPr>
+        <w:ind w:left="1440"/>
+      </w:pPr>
+      <w:r>
+        <w:t>3.1.4.1</w:t>
+      </w:r>
+    </w:p>
+    <w:p>
+      <w:pPr>
+        <w:ind w:left="1440"/>
+      </w:pPr>
+      <w:r>
+        <w:t>IT must provide an administrative interface accessible only after authentication with IT role privileges for user registration and history access.</w:t>
+      </w:r>
+    </w:p>
+    <w:p>
+      <w:pPr>
+        <w:ind w:left="1440"/>
+      </w:pPr>
+    </w:p>
+    <w:p>
+      <w:pPr>
+        <w:ind w:left="1440"/>
+      </w:pPr>
+      <w:r>
+        <w:t>3.1.4.2</w:t>
+      </w:r>
+    </w:p>
+    <w:p>
+      <w:pPr>
+        <w:ind w:left="1440"/>
+      </w:pPr>
+      <w:r>
+        <w:t>IT must include a user registration form with fields for username, password, full name, and role selection for creating new user accounts.</w:t>
+      </w:r>
+    </w:p>
+    <w:p>
+      <w:pPr>
+        <w:ind w:left="1440"/>
+      </w:pPr>
+    </w:p>
+    <w:p>
+      <w:pPr>
+        <w:ind w:left="1440"/>
+      </w:pPr>
+      <w:r>
+        <w:t>3.1.4.3</w:t>
+      </w:r>
+    </w:p>
+    <w:p>
+      <w:pPr>
+        <w:ind w:left="1440"/>
+      </w:pPr>
+      <w:r>
+        <w:t xml:space="preserve">IT must validate that </w:t>
+      </w:r>
+      <w:r>
+        <w:t>password</w:t>
+      </w:r>
+      <w:r>
+        <w:t>s are</w:t>
+      </w:r>
+      <w:r>
+        <w:t xml:space="preserve"> between 6-30 characters before submitting registration requests to the server.</w:t>
+      </w:r>
+    </w:p>
+    <w:p>
+      <w:pPr>
+        <w:ind w:left="1440"/>
+      </w:pPr>
+    </w:p>
+    <w:p>
+      <w:pPr>
+        <w:ind w:left="1440"/>
+      </w:pPr>
+      <w:r>
+        <w:t>3.1.4.4</w:t>
+      </w:r>
+    </w:p>
+    <w:p>
+      <w:pPr>
+        <w:ind w:left="1440"/>
+      </w:pPr>
+      <w:r>
+        <w:t>IT must display success or error messages after each registration attempt, confirming new user records or reporting issues such as duplicate usernames.</w:t>
+      </w:r>
+    </w:p>
+    <w:p>
+      <w:pPr>
+        <w:ind w:left="1440"/>
+      </w:pPr>
+    </w:p>
+    <w:p>
+      <w:pPr>
+        <w:ind w:left="1440"/>
+      </w:pPr>
+      <w:r>
+        <w:t>3.1.4.5</w:t>
+      </w:r>
+    </w:p>
+    <w:p>
+      <w:pPr>
+        <w:ind w:left="1440"/>
+      </w:pPr>
+      <w:r>
+        <w:t>The IT module must provide access to view any user's complete chat history upon request, displaying all messages with timestamps and participant information.</w:t>
+      </w:r>
+    </w:p>
+    <w:p>
+      <w:pPr>
+        <w:ind w:left="1440"/>
+      </w:pPr>
+    </w:p>
+    <w:p>
+      <w:pPr>
+        <w:ind w:left="1440"/>
+      </w:pPr>
+      <w:r>
+        <w:t>3.1.4.6</w:t>
+      </w:r>
+    </w:p>
+    <w:p>
+      <w:pPr>
+        <w:ind w:left="1440"/>
+      </w:pPr>
+      <w:r>
+        <w:t>The IT module must display real-time server status information including active user connections and system health indicators.</w:t>
+      </w:r>
+    </w:p>
+    <w:p>
+      <w:pPr>
+        <w:ind w:left="1440"/>
+      </w:pPr>
+    </w:p>
+    <w:p>
+      <w:pPr>
+        <w:ind w:left="1440"/>
+      </w:pPr>
     </w:p>
     <w:p>
       <w:pPr>
@@ -5636,12 +6133,12 @@
           <w:numId w:val="2"/>
         </w:numPr>
       </w:pPr>
-      <w:bookmarkStart w:id="27" w:name="__RefHeading___Toc19440736"/>
-      <w:bookmarkEnd w:id="27"/>
+      <w:bookmarkStart w:id="18" w:name="__RefHeading___Toc19440736"/>
+      <w:bookmarkEnd w:id="18"/>
       <w:r>
         <w:t>External Interface Requirements</w:t>
       </w:r>
-      <w:bookmarkStart w:id="28" w:name="REQBUZLF2"/>
+      <w:bookmarkStart w:id="19" w:name="REQBUZLF2"/>
     </w:p>
     <w:p>
       <w:pPr>
@@ -5682,7 +6179,13 @@
         <w:ind w:left="1440"/>
       </w:pPr>
       <w:r>
-        <w:t>The Client must initiate a socket connection to the Server while the Server must continuously listen for incoming connection requests.</w:t>
+        <w:t xml:space="preserve">The Client must initiate a socket connection to the Server while the Server must continuously listen </w:t>
+      </w:r>
+      <w:r>
+        <w:t>to</w:t>
+      </w:r>
+      <w:r>
+        <w:t xml:space="preserve"> incoming connection requests.</w:t>
       </w:r>
     </w:p>
     <w:p>
@@ -5703,6 +6206,7 @@
         <w:ind w:left="1440"/>
       </w:pPr>
       <w:r>
+        <w:lastRenderedPageBreak/>
         <w:t>The system must maintain an active connection for the duration of each session and close upon logout. In the event of network failure or disconnection, the system must terminate the session, notify the Client, and detect the loss of disconnection.</w:t>
       </w:r>
     </w:p>
@@ -5809,7 +6313,6 @@
         <w:ind w:left="1440"/>
       </w:pPr>
       <w:r>
-        <w:lastRenderedPageBreak/>
         <w:t>The messaging interface must display the user’s scrollable conversation history, a text input field for sending messages including a send action, and a messaging panel of users and existing chats.</w:t>
       </w:r>
     </w:p>
@@ -5872,105 +6375,264 @@
           <w:numId w:val="2"/>
         </w:numPr>
       </w:pPr>
-      <w:bookmarkStart w:id="29" w:name="__RefHeading___Toc19440737"/>
-      <w:bookmarkEnd w:id="28"/>
-      <w:bookmarkEnd w:id="29"/>
+      <w:bookmarkStart w:id="20" w:name="__RefHeading___Toc19440737"/>
+      <w:bookmarkEnd w:id="19"/>
+      <w:bookmarkEnd w:id="20"/>
       <w:r>
         <w:t>Internal Interface Requirements</w:t>
       </w:r>
     </w:p>
-    <w:p>
-      <w:pPr>
-        <w:pStyle w:val="Paragraph2"/>
-        <w:rPr>
-          <w:color w:val="7030A0"/>
-        </w:rPr>
-      </w:pPr>
-      <w:bookmarkStart w:id="30" w:name="REQBV3515"/>
-      <w:r>
-        <w:rPr>
-          <w:color w:val="7030A0"/>
-        </w:rPr>
-        <w:t xml:space="preserve">Provide module specific requirements as appropriate. </w:t>
-      </w:r>
-      <w:r>
-        <w:rPr>
-          <w:vanish/>
-          <w:color w:val="7030A0"/>
-        </w:rPr>
-        <w:t xml:space="preserve">SR10 </w:t>
-      </w:r>
-    </w:p>
-    <w:p>
-      <w:pPr>
-        <w:pStyle w:val="Paragraph2"/>
-        <w:rPr>
-          <w:color w:val="7030A0"/>
-        </w:rPr>
-      </w:pPr>
-      <w:r>
-        <w:rPr>
-          <w:color w:val="7030A0"/>
-        </w:rPr>
-        <w:t>Example:</w:t>
-      </w:r>
-    </w:p>
-    <w:p>
-      <w:pPr>
-        <w:ind w:left="1440"/>
-        <w:rPr>
-          <w:color w:val="7030A0"/>
-        </w:rPr>
-      </w:pPr>
-      <w:r>
-        <w:rPr>
-          <w:color w:val="7030A0"/>
-        </w:rPr>
-        <w:t xml:space="preserve">3.3.1 </w:t>
-      </w:r>
-      <w:r>
-        <w:rPr>
-          <w:vanish/>
-          <w:color w:val="7030A0"/>
-        </w:rPr>
-        <w:t xml:space="preserve">SR17 </w:t>
-      </w:r>
-      <w:r>
-        <w:rPr>
-          <w:color w:val="7030A0"/>
-        </w:rPr>
-        <w:t>The system must process a data-feed from the grading system such that student grades are stored along with the historical student course enrolments. Data feed will be in the form of a comma-separated interface file that is exported from the grading system nightly.</w:t>
-      </w:r>
-      <w:bookmarkEnd w:id="30"/>
-    </w:p>
-    <w:p>
-      <w:pPr>
-        <w:ind w:left="1440"/>
-        <w:rPr>
-          <w:color w:val="7030A0"/>
-        </w:rPr>
-      </w:pPr>
-      <w:bookmarkStart w:id="31" w:name="REQBV46L8"/>
-      <w:r>
-        <w:rPr>
-          <w:color w:val="7030A0"/>
-        </w:rPr>
-        <w:t xml:space="preserve">3.3.2 </w:t>
-      </w:r>
-      <w:r>
-        <w:rPr>
-          <w:vanish/>
-          <w:color w:val="7030A0"/>
-        </w:rPr>
-        <w:t xml:space="preserve">SR24 </w:t>
-      </w:r>
-      <w:r>
-        <w:rPr>
-          <w:color w:val="7030A0"/>
-        </w:rPr>
-        <w:t>The system must process a data-feed from the University billing system that contains new student records. The feed will be in the form of a comma-separated text file and will be exported from the billing system nightly with new student records. The fields included in the file are student name, student id, and student pin number.  </w:t>
-      </w:r>
-      <w:bookmarkEnd w:id="31"/>
+    <w:p/>
+    <w:p>
+      <w:pPr>
+        <w:ind w:left="1440"/>
+      </w:pPr>
+      <w:r>
+        <w:t>3.3.1</w:t>
+      </w:r>
+    </w:p>
+    <w:p>
+      <w:pPr>
+        <w:ind w:left="1440"/>
+      </w:pPr>
+      <w:r>
+        <w:t>The system must enforce immutable message storage by ensuring all file write operations use append mode only. No user, including IT, will have the ability to update or delete any stored messages.</w:t>
+      </w:r>
+    </w:p>
+    <w:p>
+      <w:pPr>
+        <w:ind w:left="1440"/>
+      </w:pPr>
+    </w:p>
+    <w:p>
+      <w:pPr>
+        <w:ind w:left="1440"/>
+      </w:pPr>
+      <w:r>
+        <w:t>3.3.2</w:t>
+      </w:r>
+    </w:p>
+    <w:p>
+      <w:pPr>
+        <w:ind w:left="1440"/>
+      </w:pPr>
+      <w:r>
+        <w:t xml:space="preserve">The server must permanently store every text message by appending user specific history files. Each message record must include the timestamp, sender, recipient, and plain text messages. Storage will be done without any modification or deletion. </w:t>
+      </w:r>
+    </w:p>
+    <w:p>
+      <w:pPr>
+        <w:ind w:left="1440"/>
+      </w:pPr>
+    </w:p>
+    <w:p>
+      <w:pPr>
+        <w:ind w:left="1440"/>
+      </w:pPr>
+      <w:r>
+        <w:t>3.3.3</w:t>
+      </w:r>
+    </w:p>
+    <w:p>
+      <w:pPr>
+        <w:ind w:left="1440"/>
+      </w:pPr>
+      <w:r>
+        <w:t xml:space="preserve">The server must maintain a text message queue for each offline user when offline. When users reconnect and log in, all queued text messages are delivered in the order they were received and remain permanently stored in the user's history </w:t>
+      </w:r>
+    </w:p>
+    <w:p>
+      <w:pPr>
+        <w:ind w:left="1440"/>
+      </w:pPr>
+      <w:r>
+        <w:lastRenderedPageBreak/>
+        <w:t>3.3.4</w:t>
+      </w:r>
+    </w:p>
+    <w:p>
+      <w:pPr>
+        <w:ind w:left="1440"/>
+      </w:pPr>
+      <w:r>
+        <w:t>Only IT users have access to view text message history. The server must verify the role of the user’s from the active session before granting access to the history file</w:t>
+      </w:r>
+      <w:r>
+        <w:t xml:space="preserve">. </w:t>
+      </w:r>
+      <w:r>
+        <w:t xml:space="preserve">Regular users requesting a history record will receive an access denied response </w:t>
+      </w:r>
+    </w:p>
+    <w:p>
+      <w:pPr>
+        <w:ind w:left="1440"/>
+      </w:pPr>
+    </w:p>
+    <w:p>
+      <w:pPr>
+        <w:ind w:left="1440"/>
+      </w:pPr>
+      <w:r>
+        <w:t>3.3.5</w:t>
+      </w:r>
+    </w:p>
+    <w:p>
+      <w:pPr>
+        <w:ind w:left="1440"/>
+      </w:pPr>
+      <w:r>
+        <w:t xml:space="preserve">The server module must provide a shutdown that saves all offline text messages, closes all client connections, and releases all file handles before terminating </w:t>
+      </w:r>
+    </w:p>
+    <w:p>
+      <w:pPr>
+        <w:ind w:left="1440"/>
+      </w:pPr>
+    </w:p>
+    <w:p>
+      <w:pPr>
+        <w:ind w:left="1440"/>
+      </w:pPr>
+      <w:r>
+        <w:t>3.3.6</w:t>
+      </w:r>
+    </w:p>
+    <w:p>
+      <w:pPr>
+        <w:ind w:left="1440"/>
+      </w:pPr>
+      <w:r>
+        <w:t xml:space="preserve">The Group management subsystem must maintain group data for each text-based group chat created in the system, including group name, admin username, and each member in the group username for each group chat created in the system </w:t>
+      </w:r>
+    </w:p>
+    <w:p>
+      <w:pPr>
+        <w:ind w:left="1440"/>
+      </w:pPr>
+    </w:p>
+    <w:p>
+      <w:pPr>
+        <w:ind w:left="1440"/>
+      </w:pPr>
+      <w:r>
+        <w:t>3.3.7</w:t>
+      </w:r>
+    </w:p>
+    <w:p>
+      <w:pPr>
+        <w:ind w:left="1440"/>
+      </w:pPr>
+      <w:r>
+        <w:t>The server must reject any non-</w:t>
+      </w:r>
+      <w:r>
+        <w:t>text-based</w:t>
+      </w:r>
+      <w:r>
+        <w:t xml:space="preserve"> communication. Any messages attempting to include binary data, images, or media files must be rejected and the sender must </w:t>
+      </w:r>
+      <w:r>
+        <w:t>receive</w:t>
+      </w:r>
+      <w:r>
+        <w:t xml:space="preserve"> </w:t>
+      </w:r>
+      <w:r>
+        <w:t>an</w:t>
+      </w:r>
+      <w:r>
+        <w:t xml:space="preserve"> error notification</w:t>
+      </w:r>
+    </w:p>
+    <w:p>
+      <w:pPr>
+        <w:ind w:left="1440"/>
+      </w:pPr>
+    </w:p>
+    <w:p>
+      <w:pPr>
+        <w:ind w:left="1440"/>
+      </w:pPr>
+      <w:r>
+        <w:t>3.3.8</w:t>
+      </w:r>
+    </w:p>
+    <w:p>
+      <w:pPr>
+        <w:ind w:left="1440"/>
+      </w:pPr>
+      <w:r>
+        <w:t xml:space="preserve">The user must maintain user database that stores all registered usernames, password, and roles( admin, IT, </w:t>
+      </w:r>
+      <w:r>
+        <w:t>etc.</w:t>
+      </w:r>
+      <w:r>
+        <w:t>)</w:t>
+      </w:r>
+    </w:p>
+    <w:p>
+      <w:pPr>
+        <w:ind w:left="1440"/>
+      </w:pPr>
+    </w:p>
+    <w:p>
+      <w:pPr>
+        <w:ind w:left="1440"/>
+      </w:pPr>
+      <w:r>
+        <w:t>3.3.9</w:t>
+      </w:r>
+    </w:p>
+    <w:p>
+      <w:pPr>
+        <w:ind w:left="1440"/>
+      </w:pPr>
+      <w:r>
+        <w:t xml:space="preserve">The server must track and store the online/offline status of all registered users in real time. When connected or disconnected the server must update </w:t>
+      </w:r>
+      <w:r>
+        <w:t>its</w:t>
+      </w:r>
+      <w:r>
+        <w:t xml:space="preserve"> </w:t>
+      </w:r>
+      <w:r>
+        <w:t>status</w:t>
+      </w:r>
+    </w:p>
+    <w:p>
+      <w:pPr>
+        <w:ind w:left="1440"/>
+      </w:pPr>
+    </w:p>
+    <w:p>
+      <w:pPr>
+        <w:ind w:left="1440"/>
+      </w:pPr>
+      <w:r>
+        <w:t>3.3.10</w:t>
+      </w:r>
+    </w:p>
+    <w:p>
+      <w:pPr>
+        <w:ind w:left="1440"/>
+      </w:pPr>
+      <w:r>
+        <w:t xml:space="preserve">Server must maintain separate history files for private conversations and group conversations. Private chat history will store user specific files, while group char history must store group specific file containing all messages sent to the group with </w:t>
+      </w:r>
+      <w:r>
+        <w:t>participant</w:t>
+      </w:r>
+      <w:r>
+        <w:t xml:space="preserve"> information </w:t>
+      </w:r>
+    </w:p>
+    <w:p>
+      <w:pPr>
+        <w:ind w:left="1440"/>
+      </w:pPr>
     </w:p>
     <w:p>
       <w:pPr>
@@ -5980,8 +6642,6 @@
           <w:numId w:val="2"/>
         </w:numPr>
       </w:pPr>
-      <w:bookmarkStart w:id="32" w:name="__RefHeading___Toc19440738"/>
-      <w:bookmarkEnd w:id="32"/>
       <w:r>
         <w:lastRenderedPageBreak/>
         <w:t>Non-Functional Requirements</w:t>
@@ -5995,11 +6655,16 @@
           <w:numId w:val="2"/>
         </w:numPr>
       </w:pPr>
-      <w:bookmarkStart w:id="33" w:name="__RefHeading___Toc19440739"/>
-      <w:bookmarkEnd w:id="33"/>
+      <w:bookmarkStart w:id="21" w:name="__RefHeading___Toc19440739"/>
+      <w:bookmarkEnd w:id="21"/>
       <w:r>
         <w:t>Security and Privacy Requirements</w:t>
       </w:r>
+    </w:p>
+    <w:p>
+      <w:pPr>
+        <w:ind w:left="720" w:firstLine="720"/>
+      </w:pPr>
     </w:p>
     <w:p>
       <w:pPr>
@@ -6105,11 +6770,19 @@
           <w:numId w:val="2"/>
         </w:numPr>
       </w:pPr>
-      <w:bookmarkStart w:id="34" w:name="__RefHeading___Toc19440740"/>
-      <w:bookmarkEnd w:id="34"/>
+      <w:bookmarkStart w:id="22" w:name="__RefHeading___Toc19440740"/>
+      <w:bookmarkEnd w:id="22"/>
       <w:r>
         <w:t>Environmental Requirements</w:t>
       </w:r>
+    </w:p>
+    <w:p>
+      <w:pPr>
+        <w:ind w:left="1440"/>
+        <w:rPr>
+          <w:color w:val="000000" w:themeColor="text1"/>
+        </w:rPr>
+      </w:pPr>
     </w:p>
     <w:p>
       <w:pPr>
@@ -6353,8 +7026,8 @@
           <w:numId w:val="2"/>
         </w:numPr>
       </w:pPr>
-      <w:bookmarkStart w:id="35" w:name="__RefHeading___Toc19440741"/>
-      <w:bookmarkEnd w:id="35"/>
+      <w:bookmarkStart w:id="23" w:name="__RefHeading___Toc19440741"/>
+      <w:bookmarkEnd w:id="23"/>
       <w:r>
         <w:t>Performance Requirements</w:t>
       </w:r>
@@ -6366,61 +7039,19 @@
           <w:color w:val="7030A0"/>
         </w:rPr>
       </w:pPr>
-      <w:bookmarkStart w:id="36" w:name="REQBV5SS8"/>
-      <w:r>
-        <w:rPr>
-          <w:color w:val="7030A0"/>
-        </w:rPr>
-        <w:t>Example:</w:t>
-      </w:r>
-    </w:p>
-    <w:p>
-      <w:pPr>
-        <w:ind w:left="1440"/>
-        <w:rPr>
-          <w:color w:val="7030A0"/>
-        </w:rPr>
-      </w:pPr>
-      <w:r>
-        <w:rPr>
-          <w:color w:val="7030A0"/>
-        </w:rPr>
-        <w:t xml:space="preserve">4.3.1 </w:t>
-      </w:r>
-      <w:r>
-        <w:rPr>
-          <w:vanish/>
-          <w:color w:val="7030A0"/>
-        </w:rPr>
-        <w:t xml:space="preserve">SR27 </w:t>
-      </w:r>
-      <w:r>
-        <w:rPr>
-          <w:color w:val="7030A0"/>
-        </w:rPr>
-        <w:t>System must render all UI pages in no more than 9 seconds for dynamic pages. Static pages (HTML-only) must be rendered in less than 3 seconds. </w:t>
-      </w:r>
-      <w:bookmarkEnd w:id="36"/>
-    </w:p>
-    <w:p>
-      <w:pPr>
-        <w:ind w:left="1440"/>
-        <w:rPr>
-          <w:color w:val="7030A0"/>
-        </w:rPr>
-      </w:pPr>
-    </w:p>
-    <w:p>
-      <w:pPr>
-        <w:ind w:left="1440"/>
-        <w:rPr>
-          <w:color w:val="000000" w:themeColor="text1"/>
-        </w:rPr>
-      </w:pPr>
-      <w:r>
-        <w:rPr>
-          <w:color w:val="000000" w:themeColor="text1"/>
-        </w:rPr>
+    </w:p>
+    <w:p>
+      <w:pPr>
+        <w:ind w:left="1440"/>
+        <w:rPr>
+          <w:color w:val="000000" w:themeColor="text1"/>
+        </w:rPr>
+      </w:pPr>
+      <w:r>
+        <w:rPr>
+          <w:color w:val="000000" w:themeColor="text1"/>
+        </w:rPr>
+        <w:lastRenderedPageBreak/>
         <w:t>4.3.1</w:t>
       </w:r>
     </w:p>
@@ -6653,7 +7284,7 @@
 
 <file path=word/comments.xml><?xml version="1.0" encoding="utf-8"?>
 <w:comments xmlns:wpc="http://schemas.microsoft.com/office/word/2010/wordprocessingCanvas" xmlns:cx="http://schemas.microsoft.com/office/drawing/2014/chartex" xmlns:cx1="http://schemas.microsoft.com/office/drawing/2015/9/8/chartex" xmlns:cx2="http://schemas.microsoft.com/office/drawing/2015/10/21/chartex" xmlns:cx3="http://schemas.microsoft.com/office/drawing/2016/5/9/chartex" xmlns:cx4="http://schemas.microsoft.com/office/drawing/2016/5/10/chartex" xmlns:cx5="http://schemas.microsoft.com/office/drawing/2016/5/11/chartex" xmlns:cx6="http://schemas.microsoft.com/office/drawing/2016/5/12/chartex" xmlns:cx7="http://schemas.microsoft.com/office/drawing/2016/5/13/chartex" xmlns:cx8="http://schemas.microsoft.com/office/drawing/2016/5/14/chartex" xmlns:mc="http://schemas.openxmlformats.org/markup-compatibility/2006" xmlns:aink="http://schemas.microsoft.com/office/drawing/2016/ink" xmlns:am3d="http://schemas.microsoft.com/office/drawing/2017/model3d" xmlns:o="urn:schemas-microsoft-com:office:office" xmlns:oel="http://schemas.microsoft.com/office/2019/extlst" xmlns:r="http://schemas.openxmlformats.org/officeDocument/2006/relationships" xmlns:m="http://schemas.openxmlformats.org/officeDocument/2006/math" xmlns:v="urn:schemas-microsoft-com:vml" xmlns:wp14="http://schemas.microsoft.com/office/word/2010/wordprocessingDrawing" xmlns:wp="http://schemas.openxmlformats.org/drawingml/2006/wordprocessingDrawing" xmlns:w10="urn:schemas-microsoft-com:office:word" xmlns:w="http://schemas.openxmlformats.org/wordprocessingml/2006/main" xmlns:w14="http://schemas.microsoft.com/office/word/2010/wordml" xmlns:w15="http://schemas.microsoft.com/office/word/2012/wordml" xmlns:w16cex="http://schemas.microsoft.com/office/word/2018/wordml/cex" xmlns:w16cid="http://schemas.microsoft.com/office/word/2016/wordml/cid" xmlns:w16="http://schemas.microsoft.com/office/word/2018/wordml" xmlns:w16du="http://schemas.microsoft.com/office/word/2023/wordml/word16du" xmlns:w16sdtdh="http://schemas.microsoft.com/office/word/2020/wordml/sdtdatahash" xmlns:w16sdtfl="http://schemas.microsoft.com/office/word/2024/wordml/sdtformatlock" xmlns:w16se="http://schemas.microsoft.com/office/word/2015/wordml/symex" xmlns:wpg="http://schemas.microsoft.com/office/word/2010/wordprocessingGroup" xmlns:wpi="http://schemas.microsoft.com/office/word/2010/wordprocessingInk" xmlns:wne="http://schemas.microsoft.com/office/word/2006/wordml" xmlns:wps="http://schemas.microsoft.com/office/word/2010/wordprocessingShape" mc:Ignorable="w14 w15 w16se w16cid w16 w16cex w16sdtdh w16sdtfl w16du wp14">
-  <w:comment w:id="5" w:author="Darien Chau" w:date="2026-02-21T09:44:00Z" w:initials="DC">
+  <w:comment w:id="6" w:author="Darien Chau" w:date="2026-02-21T09:19:00Z" w:initials="DC">
     <w:p>
       <w:pPr>
         <w:pStyle w:val="CommentText"/>
@@ -6665,11 +7296,11 @@
         <w:annotationRef/>
       </w:r>
       <w:r>
-        <w:t>assigned to: victor, darien</w:t>
+        <w:t>email chris about this</w:t>
       </w:r>
     </w:p>
   </w:comment>
-  <w:comment w:id="6" w:author="Darien Chau" w:date="2026-02-26T09:36:00Z" w:initials="DC">
+  <w:comment w:id="7" w:author="Darien Chau" w:date="2026-02-26T09:35:00Z" w:initials="DC">
     <w:p>
       <w:pPr>
         <w:pStyle w:val="CommentText"/>
@@ -6681,11 +7312,11 @@
         <w:annotationRef/>
       </w:r>
       <w:r>
-        <w:t>TODO: Add Victor’s Latest</w:t>
+        <w:t>he will want us to use this; as we are going to be making at minimum the Use Case Specs</w:t>
       </w:r>
     </w:p>
   </w:comment>
-  <w:comment w:id="8" w:author="Darien Chau" w:date="2026-02-21T09:19:00Z" w:initials="DC">
+  <w:comment w:id="8" w:author="Darien Chau" w:date="2026-02-27T11:14:00Z" w:initials="DC">
     <w:p>
       <w:pPr>
         <w:pStyle w:val="CommentText"/>
@@ -6697,122 +7328,7 @@
         <w:annotationRef/>
       </w:r>
       <w:r>
-        <w:t>email chris about this</w:t>
-      </w:r>
-    </w:p>
-  </w:comment>
-  <w:comment w:id="9" w:author="Darien Chau" w:date="2026-02-26T09:35:00Z" w:initials="DC">
-    <w:p>
-      <w:pPr>
-        <w:pStyle w:val="CommentText"/>
-      </w:pPr>
-      <w:r>
-        <w:rPr>
-          <w:rStyle w:val="CommentReference"/>
-        </w:rPr>
-        <w:annotationRef/>
-      </w:r>
-      <w:r>
-        <w:t>he will want us to use this; as we are going to be making at minimum the Use Case Specs</w:t>
-      </w:r>
-    </w:p>
-  </w:comment>
-  <w:comment w:id="13" w:author="Darien Chau" w:date="2026-02-21T09:44:00Z" w:initials="DC">
-    <w:p>
-      <w:pPr>
-        <w:pStyle w:val="CommentText"/>
-      </w:pPr>
-      <w:r>
-        <w:rPr>
-          <w:rStyle w:val="CommentReference"/>
-        </w:rPr>
-        <w:annotationRef/>
-      </w:r>
-      <w:r>
-        <w:t>victor</w:t>
-      </w:r>
-      <w:r>
-        <w:br/>
-      </w:r>
-    </w:p>
-  </w:comment>
-  <w:comment w:id="14" w:author="Darien Chau" w:date="2026-02-26T09:55:00Z" w:initials="DC">
-    <w:p>
-      <w:pPr>
-        <w:pStyle w:val="CommentText"/>
-      </w:pPr>
-      <w:r>
-        <w:rPr>
-          <w:rStyle w:val="CommentReference"/>
-        </w:rPr>
-        <w:annotationRef/>
-      </w:r>
-      <w:r>
-        <w:t>add new victor changes</w:t>
-      </w:r>
-    </w:p>
-  </w:comment>
-  <w:comment w:id="16" w:author="Darien Chau" w:date="2026-02-21T09:44:00Z" w:initials="DC">
-    <w:p>
-      <w:pPr>
-        <w:pStyle w:val="CommentText"/>
-      </w:pPr>
-      <w:r>
-        <w:rPr>
-          <w:rStyle w:val="CommentReference"/>
-        </w:rPr>
-        <w:annotationRef/>
-      </w:r>
-      <w:r>
-        <w:t>victor</w:t>
-      </w:r>
-    </w:p>
-  </w:comment>
-  <w:comment w:id="17" w:author="Darien Chau" w:date="2026-02-26T09:55:00Z" w:initials="DC">
-    <w:p>
-      <w:pPr>
-        <w:pStyle w:val="CommentText"/>
-      </w:pPr>
-      <w:r>
-        <w:rPr>
-          <w:rStyle w:val="CommentReference"/>
-        </w:rPr>
-        <w:annotationRef/>
-      </w:r>
-      <w:r>
-        <w:t>add new victor changes</w:t>
-      </w:r>
-    </w:p>
-  </w:comment>
-  <w:comment w:id="19" w:author="Darien Chau" w:date="2026-02-17T15:51:00Z" w:initials="DC">
-    <w:p>
-      <w:pPr>
-        <w:pStyle w:val="CommentText"/>
-      </w:pPr>
-      <w:r>
-        <w:rPr>
-          <w:rStyle w:val="CommentReference"/>
-        </w:rPr>
-        <w:annotationRef/>
-      </w:r>
-      <w:r>
-        <w:t>half Victor</w:t>
-      </w:r>
-    </w:p>
-  </w:comment>
-  <w:comment w:id="20" w:author="Darien Chau" w:date="2026-02-26T09:50:00Z" w:initials="DC">
-    <w:p>
-      <w:pPr>
-        <w:pStyle w:val="CommentText"/>
-      </w:pPr>
-      <w:r>
-        <w:rPr>
-          <w:rStyle w:val="CommentReference"/>
-        </w:rPr>
-        <w:annotationRef/>
-      </w:r>
-      <w:r>
-        <w:t>Victor’s new additions still need to be added</w:t>
+        <w:t>addendum: We want to flesh out the use-cases, and have class diagrams, use-case diagrams, and sequence diagrams starting out.</w:t>
       </w:r>
     </w:p>
   </w:comment>
@@ -6821,46 +7337,25 @@
 
 <file path=word/commentsExtended.xml><?xml version="1.0" encoding="utf-8"?>
 <w15:commentsEx xmlns:wpc="http://schemas.microsoft.com/office/word/2010/wordprocessingCanvas" xmlns:cx="http://schemas.microsoft.com/office/drawing/2014/chartex" xmlns:cx1="http://schemas.microsoft.com/office/drawing/2015/9/8/chartex" xmlns:cx2="http://schemas.microsoft.com/office/drawing/2015/10/21/chartex" xmlns:cx3="http://schemas.microsoft.com/office/drawing/2016/5/9/chartex" xmlns:cx4="http://schemas.microsoft.com/office/drawing/2016/5/10/chartex" xmlns:cx5="http://schemas.microsoft.com/office/drawing/2016/5/11/chartex" xmlns:cx6="http://schemas.microsoft.com/office/drawing/2016/5/12/chartex" xmlns:cx7="http://schemas.microsoft.com/office/drawing/2016/5/13/chartex" xmlns:cx8="http://schemas.microsoft.com/office/drawing/2016/5/14/chartex" xmlns:mc="http://schemas.openxmlformats.org/markup-compatibility/2006" xmlns:aink="http://schemas.microsoft.com/office/drawing/2016/ink" xmlns:am3d="http://schemas.microsoft.com/office/drawing/2017/model3d" xmlns:o="urn:schemas-microsoft-com:office:office" xmlns:oel="http://schemas.microsoft.com/office/2019/extlst" xmlns:r="http://schemas.openxmlformats.org/officeDocument/2006/relationships" xmlns:m="http://schemas.openxmlformats.org/officeDocument/2006/math" xmlns:v="urn:schemas-microsoft-com:vml" xmlns:wp14="http://schemas.microsoft.com/office/word/2010/wordprocessingDrawing" xmlns:wp="http://schemas.openxmlformats.org/drawingml/2006/wordprocessingDrawing" xmlns:w10="urn:schemas-microsoft-com:office:word" xmlns:w="http://schemas.openxmlformats.org/wordprocessingml/2006/main" xmlns:w14="http://schemas.microsoft.com/office/word/2010/wordml" xmlns:w15="http://schemas.microsoft.com/office/word/2012/wordml" xmlns:w16cex="http://schemas.microsoft.com/office/word/2018/wordml/cex" xmlns:w16cid="http://schemas.microsoft.com/office/word/2016/wordml/cid" xmlns:w16="http://schemas.microsoft.com/office/word/2018/wordml" xmlns:w16du="http://schemas.microsoft.com/office/word/2023/wordml/word16du" xmlns:w16sdtdh="http://schemas.microsoft.com/office/word/2020/wordml/sdtdatahash" xmlns:w16sdtfl="http://schemas.microsoft.com/office/word/2024/wordml/sdtformatlock" xmlns:w16se="http://schemas.microsoft.com/office/word/2015/wordml/symex" xmlns:wpg="http://schemas.microsoft.com/office/word/2010/wordprocessingGroup" xmlns:wpi="http://schemas.microsoft.com/office/word/2010/wordprocessingInk" xmlns:wne="http://schemas.microsoft.com/office/word/2006/wordml" xmlns:wps="http://schemas.microsoft.com/office/word/2010/wordprocessingShape" mc:Ignorable="w14 w15 w16se w16cid w16 w16cex w16sdtdh w16sdtfl w16du wp14">
-  <w15:commentEx w15:paraId="7777E0AC" w15:done="0"/>
-  <w15:commentEx w15:paraId="1DA4C046" w15:paraIdParent="7777E0AC" w15:done="0"/>
   <w15:commentEx w15:paraId="042509CA" w15:done="0"/>
   <w15:commentEx w15:paraId="4E150F1E" w15:paraIdParent="042509CA" w15:done="0"/>
-  <w15:commentEx w15:paraId="72D7F0A8" w15:done="0"/>
-  <w15:commentEx w15:paraId="7AC91A51" w15:paraIdParent="72D7F0A8" w15:done="0"/>
-  <w15:commentEx w15:paraId="14CD78A8" w15:done="0"/>
-  <w15:commentEx w15:paraId="354659C8" w15:paraIdParent="14CD78A8" w15:done="0"/>
-  <w15:commentEx w15:paraId="607BF5C5" w15:done="0"/>
-  <w15:commentEx w15:paraId="7D1AB86D" w15:paraIdParent="607BF5C5" w15:done="0"/>
+  <w15:commentEx w15:paraId="34BB9BAC" w15:paraIdParent="042509CA" w15:done="0"/>
 </w15:commentsEx>
 </file>
 
 <file path=word/commentsExtensible.xml><?xml version="1.0" encoding="utf-8"?>
 <w16cex:commentsExtensible xmlns:wpc="http://schemas.microsoft.com/office/word/2010/wordprocessingCanvas" xmlns:cx="http://schemas.microsoft.com/office/drawing/2014/chartex" xmlns:cx1="http://schemas.microsoft.com/office/drawing/2015/9/8/chartex" xmlns:cx2="http://schemas.microsoft.com/office/drawing/2015/10/21/chartex" xmlns:cx3="http://schemas.microsoft.com/office/drawing/2016/5/9/chartex" xmlns:cx4="http://schemas.microsoft.com/office/drawing/2016/5/10/chartex" xmlns:cx5="http://schemas.microsoft.com/office/drawing/2016/5/11/chartex" xmlns:cx6="http://schemas.microsoft.com/office/drawing/2016/5/12/chartex" xmlns:cx7="http://schemas.microsoft.com/office/drawing/2016/5/13/chartex" xmlns:cx8="http://schemas.microsoft.com/office/drawing/2016/5/14/chartex" xmlns:cr="http://schemas.microsoft.com/office/comments/2020/reactions" xmlns:mc="http://schemas.openxmlformats.org/markup-compatibility/2006" xmlns:aink="http://schemas.microsoft.com/office/drawing/2016/ink" xmlns:am3d="http://schemas.microsoft.com/office/drawing/2017/model3d" xmlns:o="urn:schemas-microsoft-com:office:office" xmlns:oel="http://schemas.microsoft.com/office/2019/extlst" xmlns:r="http://schemas.openxmlformats.org/officeDocument/2006/relationships" xmlns:m="http://schemas.openxmlformats.org/officeDocument/2006/math" xmlns:v="urn:schemas-microsoft-com:vml" xmlns:wp14="http://schemas.microsoft.com/office/word/2010/wordprocessingDrawing" xmlns:wp="http://schemas.openxmlformats.org/drawingml/2006/wordprocessingDrawing" xmlns:w10="urn:schemas-microsoft-com:office:word" xmlns:w="http://schemas.openxmlformats.org/wordprocessingml/2006/main" xmlns:w14="http://schemas.microsoft.com/office/word/2010/wordml" xmlns:w15="http://schemas.microsoft.com/office/word/2012/wordml" xmlns:w16cex="http://schemas.microsoft.com/office/word/2018/wordml/cex" xmlns:w16cid="http://schemas.microsoft.com/office/word/2016/wordml/cid" xmlns:w16="http://schemas.microsoft.com/office/word/2018/wordml" xmlns:w16du="http://schemas.microsoft.com/office/word/2023/wordml/word16du" xmlns:w16sdtdh="http://schemas.microsoft.com/office/word/2020/wordml/sdtdatahash" xmlns:w16sdtfl="http://schemas.microsoft.com/office/word/2024/wordml/sdtformatlock" xmlns:w16se="http://schemas.microsoft.com/office/word/2015/wordml/symex" xmlns:wpg="http://schemas.microsoft.com/office/word/2010/wordprocessingGroup" xmlns:wpi="http://schemas.microsoft.com/office/word/2010/wordprocessingInk" xmlns:wne="http://schemas.microsoft.com/office/word/2006/wordml" xmlns:wps="http://schemas.microsoft.com/office/word/2010/wordprocessingShape" mc:Ignorable="w14 w15 w16se w16cid w16 w16cex w16sdtdh w16sdtfl cr w16du wp14">
-  <w16cex:commentExtensible w16cex:durableId="7A2058F6" w16cex:dateUtc="2026-02-21T17:44:00Z"/>
-  <w16cex:commentExtensible w16cex:durableId="1F1D2529" w16cex:dateUtc="2026-02-26T17:36:00Z"/>
   <w16cex:commentExtensible w16cex:durableId="7772776E" w16cex:dateUtc="2026-02-21T17:19:00Z"/>
   <w16cex:commentExtensible w16cex:durableId="47F88CE9" w16cex:dateUtc="2026-02-26T17:35:00Z"/>
-  <w16cex:commentExtensible w16cex:durableId="49F0B684" w16cex:dateUtc="2026-02-21T17:44:00Z"/>
-  <w16cex:commentExtensible w16cex:durableId="04A45DC2" w16cex:dateUtc="2026-02-26T17:55:00Z"/>
-  <w16cex:commentExtensible w16cex:durableId="5AA762CB" w16cex:dateUtc="2026-02-21T17:44:00Z"/>
-  <w16cex:commentExtensible w16cex:durableId="1724A0D3" w16cex:dateUtc="2026-02-26T17:55:00Z"/>
-  <w16cex:commentExtensible w16cex:durableId="7AA3B27C" w16cex:dateUtc="2026-02-17T23:51:00Z"/>
-  <w16cex:commentExtensible w16cex:durableId="31DF1271" w16cex:dateUtc="2026-02-26T17:50:00Z"/>
+  <w16cex:commentExtensible w16cex:durableId="1045607F" w16cex:dateUtc="2026-02-27T19:14:00Z"/>
 </w16cex:commentsExtensible>
 </file>
 
 <file path=word/commentsIds.xml><?xml version="1.0" encoding="utf-8"?>
 <w16cid:commentsIds xmlns:wpc="http://schemas.microsoft.com/office/word/2010/wordprocessingCanvas" xmlns:cx="http://schemas.microsoft.com/office/drawing/2014/chartex" xmlns:cx1="http://schemas.microsoft.com/office/drawing/2015/9/8/chartex" xmlns:cx2="http://schemas.microsoft.com/office/drawing/2015/10/21/chartex" xmlns:cx3="http://schemas.microsoft.com/office/drawing/2016/5/9/chartex" xmlns:cx4="http://schemas.microsoft.com/office/drawing/2016/5/10/chartex" xmlns:cx5="http://schemas.microsoft.com/office/drawing/2016/5/11/chartex" xmlns:cx6="http://schemas.microsoft.com/office/drawing/2016/5/12/chartex" xmlns:cx7="http://schemas.microsoft.com/office/drawing/2016/5/13/chartex" xmlns:cx8="http://schemas.microsoft.com/office/drawing/2016/5/14/chartex" xmlns:mc="http://schemas.openxmlformats.org/markup-compatibility/2006" xmlns:aink="http://schemas.microsoft.com/office/drawing/2016/ink" xmlns:am3d="http://schemas.microsoft.com/office/drawing/2017/model3d" xmlns:o="urn:schemas-microsoft-com:office:office" xmlns:oel="http://schemas.microsoft.com/office/2019/extlst" xmlns:r="http://schemas.openxmlformats.org/officeDocument/2006/relationships" xmlns:m="http://schemas.openxmlformats.org/officeDocument/2006/math" xmlns:v="urn:schemas-microsoft-com:vml" xmlns:wp14="http://schemas.microsoft.com/office/word/2010/wordprocessingDrawing" xmlns:wp="http://schemas.openxmlformats.org/drawingml/2006/wordprocessingDrawing" xmlns:w10="urn:schemas-microsoft-com:office:word" xmlns:w="http://schemas.openxmlformats.org/wordprocessingml/2006/main" xmlns:w14="http://schemas.microsoft.com/office/word/2010/wordml" xmlns:w15="http://schemas.microsoft.com/office/word/2012/wordml" xmlns:w16cex="http://schemas.microsoft.com/office/word/2018/wordml/cex" xmlns:w16cid="http://schemas.microsoft.com/office/word/2016/wordml/cid" xmlns:w16="http://schemas.microsoft.com/office/word/2018/wordml" xmlns:w16du="http://schemas.microsoft.com/office/word/2023/wordml/word16du" xmlns:w16sdtdh="http://schemas.microsoft.com/office/word/2020/wordml/sdtdatahash" xmlns:w16sdtfl="http://schemas.microsoft.com/office/word/2024/wordml/sdtformatlock" xmlns:w16se="http://schemas.microsoft.com/office/word/2015/wordml/symex" xmlns:wpg="http://schemas.microsoft.com/office/word/2010/wordprocessingGroup" xmlns:wpi="http://schemas.microsoft.com/office/word/2010/wordprocessingInk" xmlns:wne="http://schemas.microsoft.com/office/word/2006/wordml" xmlns:wps="http://schemas.microsoft.com/office/word/2010/wordprocessingShape" mc:Ignorable="w14 w15 w16se w16cid w16 w16cex w16sdtdh w16sdtfl w16du wp14">
-  <w16cid:commentId w16cid:paraId="7777E0AC" w16cid:durableId="7A2058F6"/>
-  <w16cid:commentId w16cid:paraId="1DA4C046" w16cid:durableId="1F1D2529"/>
   <w16cid:commentId w16cid:paraId="042509CA" w16cid:durableId="7772776E"/>
   <w16cid:commentId w16cid:paraId="4E150F1E" w16cid:durableId="47F88CE9"/>
-  <w16cid:commentId w16cid:paraId="72D7F0A8" w16cid:durableId="49F0B684"/>
-  <w16cid:commentId w16cid:paraId="7AC91A51" w16cid:durableId="04A45DC2"/>
-  <w16cid:commentId w16cid:paraId="14CD78A8" w16cid:durableId="5AA762CB"/>
-  <w16cid:commentId w16cid:paraId="354659C8" w16cid:durableId="1724A0D3"/>
-  <w16cid:commentId w16cid:paraId="607BF5C5" w16cid:durableId="7AA3B27C"/>
-  <w16cid:commentId w16cid:paraId="7D1AB86D" w16cid:durableId="31DF1271"/>
+  <w16cid:commentId w16cid:paraId="34BB9BAC" w16cid:durableId="1045607F"/>
 </w16cid:commentsIds>
 </file>
 
@@ -6969,7 +7464,7 @@
         <w:noProof/>
       </w:rPr>
       <w:pict w14:anchorId="73A6F8E8">
-        <v:rect id="Rectangle 1" o:spid="_x0000_s1027" style="position:absolute;margin-left:0;margin-top:.05pt;width:5.65pt;height:1.8pt;z-index:-503316474;visibility:visible;mso-wrap-style:square;mso-width-percent:0;mso-height-percent:0;mso-wrap-distance-left:0;mso-wrap-distance-top:0;mso-wrap-distance-right:0;mso-wrap-distance-bottom:0;mso-position-horizontal:center;mso-position-horizontal-relative:margin;mso-position-vertical:absolute;mso-position-vertical-relative:text;mso-width-percent:0;mso-height-percent:0;mso-width-relative:page;mso-height-relative:page;v-text-anchor:top" o:gfxdata="" o:allowincell="f" filled="f" stroked="f" strokeweight="0">
+        <v:rect id="Rectangle 1" o:spid="_x0000_s1027" style="position:absolute;margin-left:0;margin-top:.05pt;width:5.65pt;height:1.8pt;z-index:-503316474;visibility:visible;mso-wrap-style:square;mso-width-percent:0;mso-height-percent:0;mso-wrap-distance-left:0;mso-wrap-distance-top:0;mso-wrap-distance-right:0;mso-wrap-distance-bottom:0;mso-position-horizontal:center;mso-position-horizontal-relative:margin;mso-position-vertical:absolute;mso-position-vertical-relative:text;mso-width-percent:0;mso-height-percent:0;mso-width-relative:page;mso-height-relative:page;v-text-anchor:top" o:allowincell="f" filled="f" stroked="f" strokeweight="0">
           <o:lock v:ext="edit" aspectratio="t" verticies="t" text="t" shapetype="t"/>
           <v:textbox inset="0,0,0,0">
             <w:txbxContent>
@@ -8103,7 +8598,6 @@
   <w:style w:type="character" w:default="1" w:styleId="DefaultParagraphFont">
     <w:name w:val="Default Paragraph Font"/>
     <w:uiPriority w:val="1"/>
-    <w:semiHidden/>
     <w:unhideWhenUsed/>
   </w:style>
   <w:style w:type="table" w:default="1" w:styleId="TableNormal">
@@ -8655,6 +9149,17 @@
       <w:lang w:eastAsia="en-US"/>
     </w:rPr>
   </w:style>
+  <w:style w:type="paragraph" w:styleId="ListParagraph">
+    <w:name w:val="List Paragraph"/>
+    <w:basedOn w:val="Normal"/>
+    <w:uiPriority w:val="34"/>
+    <w:qFormat/>
+    <w:rsid w:val="003F4E75"/>
+    <w:pPr>
+      <w:ind w:left="720"/>
+      <w:contextualSpacing/>
+    </w:pPr>
+  </w:style>
 </w:styles>
 </file>
 

</xml_diff>

<commit_message>
use case diagram 4-5
additionally initializing Class Diagrams
</commit_message>
<xml_diff>
--- a/SRS_Communications.docx
+++ b/SRS_Communications.docx
@@ -10119,23 +10119,7 @@
           <w:rFonts w:eastAsia="Arial"/>
           <w:color w:val="000000" w:themeColor="text1"/>
         </w:rPr>
-        <w:t>3.1.1.4, 3.1.1.5, 3.1.1.12, 3.1.</w:t>
-      </w:r>
-      <w:proofErr w:type="gramStart"/>
-      <w:r>
-        <w:rPr>
-          <w:rFonts w:eastAsia="Arial"/>
-          <w:color w:val="000000" w:themeColor="text1"/>
-        </w:rPr>
-        <w:t>1.14</w:t>
-      </w:r>
-      <w:proofErr w:type="gramEnd"/>
-      <w:r>
-        <w:rPr>
-          <w:rFonts w:eastAsia="Arial"/>
-          <w:color w:val="000000" w:themeColor="text1"/>
-        </w:rPr>
-        <w:t>, 3.1.2.3, 3.2.3, 3.3.10</w:t>
+        <w:t>3.1.1.4, 3.1.1.5, 3.1.1.12, 3.1.1.14, 3.1.2.3, 3.2.3, 3.3.10</w:t>
       </w:r>
     </w:p>
     <w:p>
@@ -10591,23 +10575,7 @@
           <w:rFonts w:eastAsia="Arial"/>
           <w:color w:val="000000" w:themeColor="text1"/>
         </w:rPr>
-        <w:t>3.1.3.6 , 3.1.</w:t>
-      </w:r>
-      <w:proofErr w:type="gramStart"/>
-      <w:r>
-        <w:rPr>
-          <w:rFonts w:eastAsia="Arial"/>
-          <w:color w:val="000000" w:themeColor="text1"/>
-        </w:rPr>
-        <w:t>1.13</w:t>
-      </w:r>
-      <w:proofErr w:type="gramEnd"/>
-      <w:r>
-        <w:rPr>
-          <w:rFonts w:eastAsia="Arial"/>
-          <w:color w:val="000000" w:themeColor="text1"/>
-        </w:rPr>
-        <w:t>, 3.1.2.4, 3.1.2.5, 3.1.3.6, 3.3.6</w:t>
+        <w:t>3.1.3.6 , 3.1.1.13, 3.1.2.4, 3.1.2.5, 3.1.3.6, 3.3.6</w:t>
       </w:r>
     </w:p>
     <w:p>
@@ -12772,15 +12740,7 @@
         <w:ind w:left="1440"/>
       </w:pPr>
       <w:r>
-        <w:t>Relevant Requirements: 3.1.1.2, 3.1.1.3, 3.1.1.8, 3.1.3.2, 3.1.3.3, 3.1.3.3</w:t>
-      </w:r>
-      <w:proofErr w:type="gramStart"/>
-      <w:r>
-        <w:t>.1, 3.1.3.3.2, 3.1.3.4</w:t>
-      </w:r>
-      <w:proofErr w:type="gramEnd"/>
-      <w:r>
-        <w:t>, 3.1.3.5, 3.1.4.1.2, 3.1.4.1.1, 3.2.2, 3.3.3.1, 3.3.4</w:t>
+        <w:t>Relevant Requirements: 3.1.1.2, 3.1.1.3, 3.1.1.8, 3.1.3.2, 3.1.3.3, 3.1.3.3.1, 3.1.3.3.2, 3.1.3.4, 3.1.3.5, 3.1.4.1.2, 3.1.4.1.1, 3.2.2, 3.3.3.1, 3.3.4</w:t>
       </w:r>
     </w:p>
     <w:p>
@@ -12989,15 +12949,7 @@
         </w:numPr>
       </w:pPr>
       <w:r>
-        <w:t xml:space="preserve">Server queues </w:t>
-      </w:r>
-      <w:proofErr w:type="gramStart"/>
-      <w:r>
-        <w:t>a message</w:t>
-      </w:r>
-      <w:proofErr w:type="gramEnd"/>
-      <w:r>
-        <w:t xml:space="preserve"> for offline members</w:t>
+        <w:t>Server queues a message for offline members</w:t>
       </w:r>
     </w:p>
     <w:p>
@@ -14310,6 +14262,24 @@
       </w:r>
     </w:p>
     <w:p>
+      <w:r>
+        <w:tab/>
+        <w:t>Answer:</w:t>
+      </w:r>
+    </w:p>
+    <w:p>
+      <w:pPr>
+        <w:pStyle w:val="ListParagraph"/>
+        <w:numPr>
+          <w:ilvl w:val="0"/>
+          <w:numId w:val="3"/>
+        </w:numPr>
+      </w:pPr>
+      <w:r>
+        <w:t xml:space="preserve">Something we can come back to later if need be, but we’ll get what we come up with, and keep moving forward with making class diagrams. </w:t>
+      </w:r>
+    </w:p>
+    <w:p>
       <w:pPr>
         <w:rPr>
           <w:noProof/>
@@ -14352,7 +14322,7 @@
         <w:rPr>
           <w:noProof/>
         </w:rPr>
-        <w:t>ZLHDJ-Cm4BtxLupW0eUoMuu5LMJJ24KYL6h8dhWuoOHQSkp8Tjlbt-_O-O125pQ7VDWpxxrvCywTTTouNIiPoz7iqS3jRTHrKbJS2QsMI-0MycJ3OYbGkLExyKFwnQvsMpG-X5TEcn-Gewe3Is7Hz275VDpSO2Mw0UdT_ZLZIZk4io9F88xejY1DZol8aZoFxXEuYAEVyrcUNPu5kTaG_alk4ABAYx703G8lhJEyNxWAiK_hrPgn2wyAChIMl-1bZv4okeevp6PBNo9HUaKWLBTpX0Ox-bAyHNXMd98xRkr1cven7-oJo3KuT_Z7BKglOm6_qOZc5SWGg7HR2XLi8kCfS6GvbqBXmc1zur-kIYthcu11ImIHgZsNeeQOFiacmQKzaVvY4DL7WB3eLNm2c1HJjT_mhuJj97-5n1XjI4sZFoT_oVw0hlSnLU_D_O_C-o85lkT2ybBYiSdV9p_Y0Pws1ddjkpebP-bnXuRXjFImupY0qw75OP13rs4lUEZYCFMaZ9gO_QFhmx4oDDguHqi3LEeT3SopQWU2nkXse6PiF2-dmTP1nC3ReAksX3WXsH7ACxxDrGHvIbUZpO6R-WY5AjxqSZyAAgufy-sKJaKDgTvSTaUL-1_ANm00</w:t>
+        <w:t>bLPDRnen4BtxLqo9LBK7KYL74aL9ILIj1A5AGa-vcDrPiBfhKzjBoh_lZ6sMZwKqvH3OzRmtRpwTM-UbzKrT2V6CTeKMhg_lbijAvT8heszkG3fuVdWImqgXziTEXwFinAdn2xHi8dDlx1UOkk23lwB1z69pTAU3STVYKWWwGkWDJLqtEl73ZY-cxG-bGxXNScvbtGkwnmdtjMeGxdAsT20jWfmvRsLySHviNoRt4o4-FQCkO8pEoJb-ZXoP-3GoSvWqFhmOJU9pfkDZnY1fymKqfDX5q5JmPte1_HlE3vnLIkFvp5G5368Ab5usdiG4b9OrmgkMv7ifdNipjX22SGIdlmC8iYWvP9IRUgPqY5g8Q4BrsV5mvV6t7ymuv07yGAlAzJ4eWtRL3ImMLmSaz8euChsIbIfWI8zKPIKhrqNFBQ8-n8UNhAA3tqH7AVg7ztlbbfLSmuErnfAMqdIm9tsFqCUCP_gm8AU1twOPo9LKbPnL-9y1F-8Rl2miocBJ1maxW0VjgKt0nPwXttMg_49HFo2VfknmPQUf-2tWLVzgqAu5dVHJwGVmtPgSUlRG9efkhMAReWEBS-N83-Ktz2m1IifjBNs-K7eE1-XtjCYZYMWYBqsZYoFOa_bwGjzOcirMGjHLaSnjCjxTAmvwl4gOvqqcHJseurHtwKugQobP2pEQifE_jiOfuCsCqrRCVxemV4xDDPZ6mwpndiSlgk3vda1ROsOZTig_yrGKRw2YJKCmGLRzRhtfb3bVTS9iMG-2smifBXC32qDRPyafIULA_72skq4SxMOggzHhqCXUfLtJzYeDVAH-evQb6yGtZWbDMRBFBTj-v-mKAWb7dkbZviTKDpbxBvigeJziWQUY7LR68HSXJcFA48SwplOZvRnG_bqeHRe3E2mUpt0pnVgib0mbJNSUhGdAtxXbvLsypngkLOkvmXK9KNh6_KYigI6XjAPEpeNOt9T_evi48SbtYN7cMYwt8MEVRLc9fwKzfes6_qtQOe-7udwAahkYffTXP7Er32hQq3OJ9cuf6FwVuWy0</w:t>
       </w:r>
     </w:p>
     <w:p>
@@ -14381,46 +14351,37 @@
           <w:noProof/>
         </w:rPr>
       </w:pPr>
-      <w:r>
+      <w:hyperlink r:id="rId14" w:history="1">
+        <w:r>
+          <w:rPr>
+            <w:rStyle w:val="Hyperlink"/>
+            <w:noProof/>
+          </w:rPr>
+          <w:t>https://img.plantuml.biz/plantuml/svg/bLPDRnen4BtxLqo9LBK7KYL74aL9ILIj1A5AGa-vcDrPiBfhKzjBoh_lZ6sMZwKqvH3OzRmtRpwTM-UbzKrT2V6CTeKMhg_lbijAvT8heszkG3fuVdWImqgXziTEXwFinAdn2xHi8dDlx1UOkk23lwB1z69pTAU3STVYKWWwGkWDJLqtEl73ZY-cxG-bGxXNScvbtGkwnmdtjMeGxdAsT20jWfmvRsLySHviNoRt4o4-FQCkO8pEoJb-ZXoP-3GoSvWqFhmOJU9pfkDZnY1fymKqfDX5q5JmPte1_HlE3vnLIkFvp5G5368Ab5usdiG4b9OrmgkMv7ifdNipjX22SGIdlmC8iYWvP9IRUgPqY5g8Q4BrsV5mvV6t7ymuv07yGAlAzJ4eWtRL3ImMLmSaz8euChsIbIfWI8zKPIKhrqNFBQ8-n8UNhAA3tqH7AVg7ztlbbfLSmuErnfAMqdIm9tsFqCUCP_gm8AU1twOPo9LKbPnL-9y1F-8Rl2miocBJ1maxW0VjgKt0nPwXttMg_49HFo2VfknmPQUf-2tWLVzgqAu5dVHJwGVmtPgSUlRG9efkhMAReWEBS-N83-Ktz2m1IifjBNs-K7eE1-XtjCYZYMWYBqsZYoFOa_bwGjzOcirMGjHLaSnjCjxTAmvwl4gOvqqcHJseurHtwKugQobP2pEQifE_jiOfuCsCqrRCVxemV4xDDPZ6mwpndiSlgk3vda1ROsOZTig_yrGKRw2YJKCmGLRzRhtfb3bVTS9iMG-2smifBXC32qDRPyafIULA_72skq4SxMOggzHhqCXUfLtJzYeDVAH-evQb6yGtZWbDMRBFBTj-v-</w:t>
+        </w:r>
+        <w:r>
+          <w:rPr>
+            <w:rStyle w:val="Hyperlink"/>
+            <w:noProof/>
+          </w:rPr>
+          <w:lastRenderedPageBreak/>
+          <w:t>mKAWb7dkbZviTKDpbxBvigeJziWQUY7LR68HSXJcFA48SwplOZvRnG_bqeHRe3E2mUpt0pnVgib0mbJNSUhGdAtxXbvLsypngkLOkvmXK9KNh6_KYigI6XjAPEpeNOt9T_evi48SbtYN7cMYwt8MEVRLc9fwKzfes6_qtQOe-7udwAahkYffTXP7Er32hQq3OJ9cuf6FwVuWy0</w:t>
+        </w:r>
+      </w:hyperlink>
+    </w:p>
+    <w:p>
+      <w:pPr>
         <w:rPr>
           <w:noProof/>
         </w:rPr>
-        <w:drawing>
-          <wp:inline distT="0" distB="0" distL="0" distR="0" wp14:anchorId="6E3BFC87" wp14:editId="4B91ABF2">
-            <wp:extent cx="5486400" cy="2147570"/>
-            <wp:effectExtent l="0" t="0" r="0" b="0"/>
-            <wp:docPr id="190346995" name="Picture 1"/>
-            <wp:cNvGraphicFramePr>
-              <a:graphicFrameLocks xmlns:a="http://schemas.openxmlformats.org/drawingml/2006/main" noChangeAspect="1"/>
-            </wp:cNvGraphicFramePr>
-            <a:graphic xmlns:a="http://schemas.openxmlformats.org/drawingml/2006/main">
-              <a:graphicData uri="http://schemas.openxmlformats.org/drawingml/2006/picture">
-                <pic:pic xmlns:pic="http://schemas.openxmlformats.org/drawingml/2006/picture">
-                  <pic:nvPicPr>
-                    <pic:cNvPr id="190346995" name=""/>
-                    <pic:cNvPicPr/>
-                  </pic:nvPicPr>
-                  <pic:blipFill>
-                    <a:blip r:embed="rId14"/>
-                    <a:stretch>
-                      <a:fillRect/>
-                    </a:stretch>
-                  </pic:blipFill>
-                  <pic:spPr>
-                    <a:xfrm>
-                      <a:off x="0" y="0"/>
-                      <a:ext cx="5486400" cy="2147570"/>
-                    </a:xfrm>
-                    <a:prstGeom prst="rect">
-                      <a:avLst/>
-                    </a:prstGeom>
-                  </pic:spPr>
-                </pic:pic>
-              </a:graphicData>
-            </a:graphic>
-          </wp:inline>
-        </w:drawing>
-      </w:r>
+      </w:pPr>
+    </w:p>
+    <w:p>
+      <w:pPr>
+        <w:rPr>
+          <w:noProof/>
+        </w:rPr>
+      </w:pPr>
     </w:p>
     <w:p>
       <w:pPr>
@@ -14449,7 +14410,6 @@
     </w:p>
     <w:p>
       <w:r>
-        <w:lastRenderedPageBreak/>
         <w:t>VP91Qy9048Nlyok6dlGGg_PIYeWX3IAO5hBa1spZg07Dokvg_tvdDXkrL7f90llUzzxCPk6yjlvyF00eiXUoE9kbfzEXgRLlJ3kVetQeyXAoGqEjVtIQhLV_d1g_9oiINNjZdr5HkmafbIFRIQf9VrXItPmYwUvy2j0QJ_XKgHopb1zltEdZ7OjSgNIPuo1BnvD45SEdKBU8SaM4ZC5CooCTloJhLL1mdSUArwGiWg8i00RI5GjoJkzes95N051DS3GI1dyaoLmM88MwmTPcvx1flK4U7EDUbfNuH2TwfjpqZb-k3q6swJQi3CyyFruQ_OSZze39ou09jsPvStGXYVuoPwvzZCIjDSUO1T1Vnft_CuH5_fPylMT8DBlUBH4Sp0OnNYdNzAsntzfkxemyIDbLOkCjb_V6c_rLeveovtRnrq4Y2c31vUK7_G40</w:t>
       </w:r>
     </w:p>
@@ -14521,7 +14481,11 @@
         <w:t xml:space="preserve">Encoding for the Use Case: </w:t>
       </w:r>
       <w:r>
-        <w:t>RLBTQi8m5Bu_Jt7mIc6owQM8M69N1aAtrZv0rXmqq2KbIIVkwNSQTTfjDmd9ztj2rZv85xgF1g0azqaEbykaRHjTow2jMQrGUYpJ0aIZoOJ_KB5z0La7wnwnyj6WtyvODRj29KbN7uGqIYiPo0zfSm1Z0-6eAbCK2IyB54MQx5BCYhnwnR58dkPJaKr6CP8F5q7oxeFZ359zEWhfoIykQR6FVy2jtQCsKRdBDpd0M3ZY4fWvsxMJw9W1L3ESJbVzF9mUHs6XPoL0VnUnx0hLqS6VBL0SP61MXipXryAV1dS31ujIAOwPHwiphQ3GESFbtpfo9-WlRnqsshUDF5smWVspDhBHNpJ8Z-gRyrxxm4qD7UzPaQJiqVo9-KK4M9DH_TVu1W00</w:t>
+        <w:t>RLBTQi8m5Bu_Jt7mIc6owQM8M69N1aAtrZv0rXmqq2KbIIVkwNSQTTfjDmd9ztj2rZv85xgF1g0azqaEbykaRHjTow2jMQrGUYpJ0aIZoOJ_KB5z0La7wnwnyj6WtyvODRj29KbN7uGqIYiPo0zfSm1Z0-6eAbCK2IyB54MQx5BCYhnwnR58dkPJaKr6CP8F5q7oxeFZ359zEWhfoIykQR6FVy2jtQCsKRdBDpd0</w:t>
+      </w:r>
+      <w:r>
+        <w:lastRenderedPageBreak/>
+        <w:t>M3ZY4fWvsxMJw9W1L3ESJbVzF9mUHs6XPoL0VnUnx0hLqS6VBL0SP61MXipXryAV1dS31ujIAOwPHwiphQ3GESFbtpfo9-WlRnqsshUDF5smWVspDhBHNpJ8Z-gRyrxxm4qD7UzPaQJiqVo9-KK4M9DH_TVu1W00</w:t>
       </w:r>
     </w:p>
     <w:p/>
@@ -14535,7 +14499,6 @@
         <w:rPr>
           <w:noProof/>
         </w:rPr>
-        <w:lastRenderedPageBreak/>
         <w:drawing>
           <wp:inline distT="0" distB="0" distL="0" distR="0" wp14:anchorId="42AD5CD1" wp14:editId="0D733CE7">
             <wp:extent cx="5486400" cy="2440305"/>
@@ -14649,6 +14612,198 @@
         </w:drawing>
       </w:r>
     </w:p>
+    <w:p/>
+    <w:p>
+      <w:pPr>
+        <w:pStyle w:val="Heading2"/>
+        <w:numPr>
+          <w:ilvl w:val="1"/>
+          <w:numId w:val="2"/>
+        </w:numPr>
+      </w:pPr>
+      <w:r>
+        <w:t>Log out Use Case Diagram</w:t>
+      </w:r>
+    </w:p>
+    <w:p/>
+    <w:p>
+      <w:r>
+        <w:t>Encoding for the Use Case:</w:t>
+      </w:r>
+    </w:p>
+    <w:p>
+      <w:r>
+        <w:t>RP31QiCm38RlVWgjWztAo3KhOIMKCIWKbkK1t4H9Grqxi-InllsaP0ihx68Rw_FdNtecjf7JnHbJOVp429lDTXpTq5WUWYyAi0JLxisKRa3F_rNB_Qkn3OVu28acWMvphSwCyO4HLdMrWt8hImxxmmiSwdTOJKG9njGPhDU5ck2UyOlpeqief0izmU3_rdEezHE9qvm9-8H0G-yX98PZOWxU6CKKbzY2L-XRcfD5_4X831pKh6yMjivcKckdS44OROyo4r7ygcwZaJIC1DPVmME3H3PU9MeNu048cGImd4XzeUlSu76HJMtgJHwnVPgaSfZRrJumnX1lQCcM6lsaI-w7kbi06SviwoEYdttJKPwLBX3gc2BQrdm3</w:t>
+      </w:r>
+    </w:p>
+    <w:p/>
+    <w:p/>
+    <w:p>
+      <w:r>
+        <w:t>Image:</w:t>
+      </w:r>
+    </w:p>
+    <w:p>
+      <w:r>
+        <w:rPr>
+          <w:noProof/>
+        </w:rPr>
+        <w:lastRenderedPageBreak/>
+        <w:drawing>
+          <wp:inline distT="0" distB="0" distL="0" distR="0" wp14:anchorId="4D8DA2DB" wp14:editId="4DAD7D61">
+            <wp:extent cx="5486400" cy="3228975"/>
+            <wp:effectExtent l="0" t="0" r="0" b="0"/>
+            <wp:docPr id="1296951389" name="drawing"/>
+            <wp:cNvGraphicFramePr>
+              <a:graphicFrameLocks xmlns:a="http://schemas.openxmlformats.org/drawingml/2006/main" noChangeAspect="1"/>
+            </wp:cNvGraphicFramePr>
+            <a:graphic xmlns:a="http://schemas.openxmlformats.org/drawingml/2006/main">
+              <a:graphicData uri="http://schemas.openxmlformats.org/drawingml/2006/picture">
+                <pic:pic xmlns:pic="http://schemas.openxmlformats.org/drawingml/2006/picture">
+                  <pic:nvPicPr>
+                    <pic:cNvPr id="1296951389" name="Picture 1296951389"/>
+                    <pic:cNvPicPr/>
+                  </pic:nvPicPr>
+                  <pic:blipFill>
+                    <a:blip r:embed="rId18">
+                      <a:extLst>
+                        <a:ext uri="{28A0092B-C50C-407E-A947-70E740481C1C}">
+                          <a14:useLocalDpi xmlns:a14="http://schemas.microsoft.com/office/drawing/2010/main"/>
+                        </a:ext>
+                      </a:extLst>
+                    </a:blip>
+                    <a:stretch>
+                      <a:fillRect/>
+                    </a:stretch>
+                  </pic:blipFill>
+                  <pic:spPr>
+                    <a:xfrm>
+                      <a:off x="0" y="0"/>
+                      <a:ext cx="5486400" cy="3228975"/>
+                    </a:xfrm>
+                    <a:prstGeom prst="rect">
+                      <a:avLst/>
+                    </a:prstGeom>
+                  </pic:spPr>
+                </pic:pic>
+              </a:graphicData>
+            </a:graphic>
+          </wp:inline>
+        </w:drawing>
+      </w:r>
+    </w:p>
+    <w:p/>
+    <w:p>
+      <w:pPr>
+        <w:pStyle w:val="Heading2"/>
+        <w:numPr>
+          <w:ilvl w:val="1"/>
+          <w:numId w:val="2"/>
+        </w:numPr>
+      </w:pPr>
+      <w:r>
+        <w:t>Search Users Use Case Diagram</w:t>
+      </w:r>
+    </w:p>
+    <w:p/>
+    <w:p>
+      <w:r>
+        <w:t>Encoding for the Use Case:</w:t>
+      </w:r>
+    </w:p>
+    <w:p>
+      <w:r>
+        <w:t>XP91QyCm38NlWVm7aPsxqMjQIajMs63ia91RBswYfWP7xYndM__zf7HqfIlR9HZflKzFTfOSJOX3xz8aJIeCxnXWFbyT3ius9bfFYmKOXcfTfadXB5AyrIvUdjF4DD671wXP45Ahfuea7n6okbf3iP9FBgHLMJo1LCeg6tM5wkefJ2OB1S5TnC-ORzs08Xzfbi7vhiCMB5s9SrXJnC30Q4Ap1pdti253BUnjP43jgaV5QfAvcWAfFNlU1Wp7SN_fNMgqYmm1Eyk2aVa3wwmDxNo0tiHcRwdxxH-tS9Om5yzC3_TRxzhPk9XYSdZr9x_WTtwWzfQv2uXqRH-B0YWn3e7u9yKfcfEab-lALVsJvD7omPaZGoPlDP8-p7Ue37faDXtUuFqPxipKE8hqkr-tg2cNyWpoxtq1</w:t>
+      </w:r>
+    </w:p>
+    <w:p/>
+    <w:p/>
+    <w:p>
+      <w:r>
+        <w:t>Image:</w:t>
+      </w:r>
+    </w:p>
+    <w:p>
+      <w:r>
+        <w:rPr>
+          <w:noProof/>
+        </w:rPr>
+        <w:drawing>
+          <wp:inline distT="0" distB="0" distL="0" distR="0" wp14:anchorId="13AFD991" wp14:editId="5C3A55A8">
+            <wp:extent cx="5486400" cy="2600325"/>
+            <wp:effectExtent l="0" t="0" r="0" b="0"/>
+            <wp:docPr id="49998541" name="drawing"/>
+            <wp:cNvGraphicFramePr>
+              <a:graphicFrameLocks xmlns:a="http://schemas.openxmlformats.org/drawingml/2006/main" noChangeAspect="1"/>
+            </wp:cNvGraphicFramePr>
+            <a:graphic xmlns:a="http://schemas.openxmlformats.org/drawingml/2006/main">
+              <a:graphicData uri="http://schemas.openxmlformats.org/drawingml/2006/picture">
+                <pic:pic xmlns:pic="http://schemas.openxmlformats.org/drawingml/2006/picture">
+                  <pic:nvPicPr>
+                    <pic:cNvPr id="49998541" name="Picture 49998541"/>
+                    <pic:cNvPicPr/>
+                  </pic:nvPicPr>
+                  <pic:blipFill>
+                    <a:blip r:embed="rId19">
+                      <a:extLst>
+                        <a:ext uri="{28A0092B-C50C-407E-A947-70E740481C1C}">
+                          <a14:useLocalDpi xmlns:a14="http://schemas.microsoft.com/office/drawing/2010/main"/>
+                        </a:ext>
+                      </a:extLst>
+                    </a:blip>
+                    <a:stretch>
+                      <a:fillRect/>
+                    </a:stretch>
+                  </pic:blipFill>
+                  <pic:spPr>
+                    <a:xfrm>
+                      <a:off x="0" y="0"/>
+                      <a:ext cx="5486400" cy="2600325"/>
+                    </a:xfrm>
+                    <a:prstGeom prst="rect">
+                      <a:avLst/>
+                    </a:prstGeom>
+                  </pic:spPr>
+                </pic:pic>
+              </a:graphicData>
+            </a:graphic>
+          </wp:inline>
+        </w:drawing>
+      </w:r>
+    </w:p>
+    <w:p>
+      <w:pPr>
+        <w:pStyle w:val="Heading"/>
+      </w:pPr>
+      <w:r>
+        <w:lastRenderedPageBreak/>
+        <w:t>CLASS PLANTUML EXAMPLE</w:t>
+      </w:r>
+    </w:p>
+    <w:p>
+      <w:pPr>
+        <w:rPr>
+          <w:b/>
+          <w:bCs/>
+          <w:u w:val="single"/>
+        </w:rPr>
+      </w:pPr>
+      <w:r>
+        <w:rPr>
+          <w:b/>
+          <w:bCs/>
+          <w:u w:val="single"/>
+        </w:rPr>
+        <w:t>ENCODING:</w:t>
+      </w:r>
+    </w:p>
+    <w:p>
+      <w:r>
+        <w:t>hLVDSgD64Bxp59mIj6khaciEgIK8swfeaGhGkZPRgHI6jZG9FzJC89UTvDtJGoE65budXrpCg7zwkh_-fcVyGUbCwgugdH8UjQiRLuh3KRk5a91hqTJEj-xrzRKRHlkFYLavK7ULwmV1TX-bloMfd-uJzqzdkmiZ9zXiat3b9Fi4VwrmTRFnRs_n-xV3tTBFkn2TWhim-7aTtJg9_ma_YHF4uMgTZkPfx4U97wJhRNHskL-dTwlOlzyugt2tJT2uDxe9OoUCustiRDCxN6C4odkz2gDqdNvslt5tOPni8oeYBpEbNBye92Y5OQzTfIM0Zhhg0QJxWojgZSAiHN0ggAqyqLBK1_VBTylbzx-ERgC29RdGpzFVBw8Tuo7O6gpIUNzEmLlWkaMXzXQZ7aK7qCaaiLw9HgJnUNPVyPo90qnm9ln5j3nuObBbPkeYcNe2bZ4yDQ8WCvlPsvPZZXSmCXjAcC7AzIRt4MMkeYeOxDOPIK8ys85KJTtJeCugc7Ole_wWQEYKQHhPUmkxP6vNSw-5IwX6MKMW6WSIZGomrfIxiMM1MTdMSRxPhC2WKxgfGFOb_jw8UaM0c0zAq4QdK9OWFmabD5VuwSSBQQT0HXSujQ8c_16VSRiUeVoOrGVO2GG9ddPdiuLDhj-PKfDm44g378du9FInaDcJbrLDLviSYgPxA64nhj280dWBU-g7EJCzwdbk0lIxPBHEdriiWSyagpNCwGoeVDGPWquV6obUeDWZ46XYuVtopio4XwpCwXniYWGaMbiCqVD40wLV86hd53qzp-lApSzRsDqCk48bdMgXBg3e2VJGD2MA7oN02qmbNJsNvMMZuBphI1eY9Q_HQ7cLxmt7kPNNAPuVY_WJWUAnpfcTR3DGnyl-hmGee6sKq7CRljM6ce3RK1jGggoqi4U2PquTMkzcmv0f-85BiXEQgIdhaD0WGUaODx29OIHkwv42BQOE_VMGFPz1n6K5aqhvO5XF7BqXogks1sRBUcD7nn7oFp2_IIbZKygDg8IUydpen8NSSCs6OLKoZmNbj9g8E5_KXNBg_BMktzjav_58lRBgLs9ecTNg4MGWeK2BOJwW1Gc6Ybvr6LexyL6S62nfZhmDJxYRsPGR4I_tBMQn25CcS6hDINE98GMQ0VWcW-mJBBg9_IIDzq6wZqDyY6ssjxVut9jCPpf9T4pQwRLIDWSpO3VDuK13yfILmfnKb61TvlgZwM_7cibfTbX9n9YF4MYkuO96cjajF46jvmUwDpBf5TEBa_gSzUzakarcJrRJjAQYmshBOeEAUeKRUFyUxceMxUeosEHcnQkxJphFr75wIXypKKBXQmrLgvLzdM8NH0v1KxKbQ2Wif1Z8KyEqiw-H_t4yqtmOnjlRmOHgo-mvQEf78QlCO3Msowf3AHivogcrelP4GSLUsVSAjnamyN19p9WomLBXG6Irz2G6lKOinYimVtbWUqxYSEERHYTtwntzbpBUkEzGFHnZP_Ywo-NvxN0nej7rhnz7Spv5cCfUF5p7Ts4tCfEpXz6OBCMXTx53XvE9w8C1njSkee4MxmPW-v_B_h_GvVmuKSa8IDTUdnq-G5rqLVaF</w:t>
+      </w:r>
+    </w:p>
+    <w:p/>
+    <w:p/>
     <w:p>
       <w:r>
         <w:rPr>
@@ -14671,7 +14826,7 @@
                     <pic:cNvPicPr/>
                   </pic:nvPicPr>
                   <pic:blipFill>
-                    <a:blip r:embed="rId18">
+                    <a:blip r:embed="rId20">
                       <a:extLst>
                         <a:ext uri="{28A0092B-C50C-407E-A947-70E740481C1C}">
                           <a14:useLocalDpi xmlns:a14="http://schemas.microsoft.com/office/drawing/2010/main"/>
@@ -14720,7 +14875,7 @@
                     <pic:cNvPicPr/>
                   </pic:nvPicPr>
                   <pic:blipFill>
-                    <a:blip r:embed="rId19">
+                    <a:blip r:embed="rId21">
                       <a:extLst>
                         <a:ext uri="{28A0092B-C50C-407E-A947-70E740481C1C}">
                           <a14:useLocalDpi xmlns:a14="http://schemas.microsoft.com/office/drawing/2010/main"/>
@@ -14880,7 +15035,7 @@
                     <pic:cNvPicPr/>
                   </pic:nvPicPr>
                   <pic:blipFill>
-                    <a:blip r:embed="rId20">
+                    <a:blip r:embed="rId22">
                       <a:extLst>
                         <a:ext uri="{28A0092B-C50C-407E-A947-70E740481C1C}">
                           <a14:useLocalDpi xmlns:a14="http://schemas.microsoft.com/office/drawing/2010/main"/>
@@ -14958,7 +15113,7 @@
                     <pic:cNvPicPr/>
                   </pic:nvPicPr>
                   <pic:blipFill>
-                    <a:blip r:embed="rId21">
+                    <a:blip r:embed="rId23">
                       <a:extLst>
                         <a:ext uri="{28A0092B-C50C-407E-A947-70E740481C1C}">
                           <a14:useLocalDpi xmlns:a14="http://schemas.microsoft.com/office/drawing/2010/main"/>
@@ -15021,7 +15176,7 @@
                     <pic:cNvPicPr/>
                   </pic:nvPicPr>
                   <pic:blipFill>
-                    <a:blip r:embed="rId22">
+                    <a:blip r:embed="rId24">
                       <a:extLst>
                         <a:ext uri="{28A0092B-C50C-407E-A947-70E740481C1C}">
                           <a14:useLocalDpi xmlns:a14="http://schemas.microsoft.com/office/drawing/2010/main"/>
@@ -15154,17 +15309,8 @@
                     <w:rStyle w:val="PageNumber"/>
                     <w:color w:val="000000"/>
                   </w:rPr>
-                  <w:t>vii</w:t>
+                  <w:t>viii</w:t>
                 </w:r>
-                <w:proofErr w:type="spellStart"/>
-                <w:r>
-                  <w:rPr>
-                    <w:rStyle w:val="PageNumber"/>
-                    <w:color w:val="000000"/>
-                  </w:rPr>
-                  <w:t>i</w:t>
-                </w:r>
-                <w:proofErr w:type="spellEnd"/>
                 <w:r>
                   <w:rPr>
                     <w:rStyle w:val="PageNumber"/>
@@ -18786,6 +18932,125 @@
     </w:lvl>
   </w:abstractNum>
   <w:abstractNum w:abstractNumId="40" w15:restartNumberingAfterBreak="0">
+    <w:nsid w:val="792E2343"/>
+    <w:multiLevelType w:val="multilevel"/>
+    <w:tmpl w:val="7DC0CAAE"/>
+    <w:lvl w:ilvl="0">
+      <w:start w:val="1"/>
+      <w:numFmt w:val="decimal"/>
+      <w:lvlText w:val="%1."/>
+      <w:lvlJc w:val="left"/>
+      <w:pPr>
+        <w:tabs>
+          <w:tab w:val="num" w:pos="720"/>
+        </w:tabs>
+        <w:ind w:left="720" w:hanging="720"/>
+      </w:pPr>
+      <w:rPr>
+        <w:b/>
+        <w:kern w:val="2"/>
+        <w:sz w:val="36"/>
+        <w:lang w:val="en-US" w:bidi="en-US"/>
+      </w:rPr>
+    </w:lvl>
+    <w:lvl w:ilvl="1">
+      <w:start w:val="1"/>
+      <w:numFmt w:val="decimal"/>
+      <w:lvlText w:val="%1.%2."/>
+      <w:lvlJc w:val="left"/>
+      <w:pPr>
+        <w:tabs>
+          <w:tab w:val="num" w:pos="720"/>
+        </w:tabs>
+        <w:ind w:left="1440" w:hanging="720"/>
+      </w:pPr>
+    </w:lvl>
+    <w:lvl w:ilvl="2">
+      <w:start w:val="1"/>
+      <w:numFmt w:val="decimal"/>
+      <w:lvlText w:val="%1.%2.%3."/>
+      <w:lvlJc w:val="left"/>
+      <w:pPr>
+        <w:tabs>
+          <w:tab w:val="num" w:pos="720"/>
+        </w:tabs>
+        <w:ind w:left="2160" w:hanging="720"/>
+      </w:pPr>
+    </w:lvl>
+    <w:lvl w:ilvl="3">
+      <w:start w:val="1"/>
+      <w:numFmt w:val="decimal"/>
+      <w:lvlText w:val="%1.%2.%3.%4."/>
+      <w:lvlJc w:val="left"/>
+      <w:pPr>
+        <w:tabs>
+          <w:tab w:val="num" w:pos="720"/>
+        </w:tabs>
+        <w:ind w:left="2880" w:hanging="720"/>
+      </w:pPr>
+    </w:lvl>
+    <w:lvl w:ilvl="4">
+      <w:start w:val="1"/>
+      <w:numFmt w:val="decimal"/>
+      <w:lvlText w:val="%1.%2.%3.%4.%5."/>
+      <w:lvlJc w:val="left"/>
+      <w:pPr>
+        <w:tabs>
+          <w:tab w:val="num" w:pos="720"/>
+        </w:tabs>
+        <w:ind w:left="3600" w:hanging="720"/>
+      </w:pPr>
+    </w:lvl>
+    <w:lvl w:ilvl="5">
+      <w:start w:val="1"/>
+      <w:numFmt w:val="decimal"/>
+      <w:lvlText w:val="%1.%2.%3.%4.%5.%6."/>
+      <w:lvlJc w:val="left"/>
+      <w:pPr>
+        <w:tabs>
+          <w:tab w:val="num" w:pos="720"/>
+        </w:tabs>
+        <w:ind w:left="4320" w:hanging="720"/>
+      </w:pPr>
+    </w:lvl>
+    <w:lvl w:ilvl="6">
+      <w:start w:val="1"/>
+      <w:numFmt w:val="decimal"/>
+      <w:lvlText w:val="%1.%2.%3.%4.%5.%6.%7."/>
+      <w:lvlJc w:val="left"/>
+      <w:pPr>
+        <w:tabs>
+          <w:tab w:val="num" w:pos="720"/>
+        </w:tabs>
+        <w:ind w:left="5040" w:hanging="720"/>
+      </w:pPr>
+    </w:lvl>
+    <w:lvl w:ilvl="7">
+      <w:start w:val="1"/>
+      <w:numFmt w:val="decimal"/>
+      <w:lvlText w:val="%1.%2.%3.%4.%5.%6.%7.%8."/>
+      <w:lvlJc w:val="left"/>
+      <w:pPr>
+        <w:tabs>
+          <w:tab w:val="num" w:pos="720"/>
+        </w:tabs>
+        <w:ind w:left="5760" w:hanging="720"/>
+      </w:pPr>
+    </w:lvl>
+    <w:lvl w:ilvl="8">
+      <w:start w:val="1"/>
+      <w:numFmt w:val="decimal"/>
+      <w:lvlText w:val="%1.%2.%3.%4.%5.%6.%7.%8.%9."/>
+      <w:lvlJc w:val="left"/>
+      <w:pPr>
+        <w:tabs>
+          <w:tab w:val="num" w:pos="720"/>
+        </w:tabs>
+        <w:ind w:left="6480" w:hanging="720"/>
+      </w:pPr>
+    </w:lvl>
+  </w:abstractNum>
+  <w:abstractNum w:abstractNumId="41" w15:restartNumberingAfterBreak="0">
     <w:nsid w:val="7B250A31"/>
     <w:multiLevelType w:val="hybridMultilevel"/>
     <w:tmpl w:val="5BD45390"/>
@@ -18871,7 +19136,7 @@
       </w:pPr>
     </w:lvl>
   </w:abstractNum>
-  <w:abstractNum w:abstractNumId="41" w15:restartNumberingAfterBreak="0">
+  <w:abstractNum w:abstractNumId="42" w15:restartNumberingAfterBreak="0">
     <w:nsid w:val="7CB633AE"/>
     <w:multiLevelType w:val="hybridMultilevel"/>
     <w:tmpl w:val="97C298DA"/>
@@ -18991,7 +19256,7 @@
     <w:abstractNumId w:val="28"/>
   </w:num>
   <w:num w:numId="12" w16cid:durableId="1262496786">
-    <w:abstractNumId w:val="41"/>
+    <w:abstractNumId w:val="42"/>
   </w:num>
   <w:num w:numId="13" w16cid:durableId="50349870">
     <w:abstractNumId w:val="27"/>
@@ -19024,7 +19289,7 @@
     <w:abstractNumId w:val="34"/>
   </w:num>
   <w:num w:numId="23" w16cid:durableId="399445128">
-    <w:abstractNumId w:val="40"/>
+    <w:abstractNumId w:val="41"/>
   </w:num>
   <w:num w:numId="24" w16cid:durableId="2030252345">
     <w:abstractNumId w:val="13"/>
@@ -19217,6 +19482,9 @@
   </w:num>
   <w:num w:numId="42" w16cid:durableId="1110664946">
     <w:abstractNumId w:val="33"/>
+  </w:num>
+  <w:num w:numId="43" w16cid:durableId="2068800222">
+    <w:abstractNumId w:val="40"/>
   </w:num>
   <w:numIdMacAtCleanup w:val="42"/>
 </w:numbering>
@@ -19817,7 +20085,6 @@
   <w:style w:type="character" w:default="1" w:styleId="DefaultParagraphFont">
     <w:name w:val="Default Paragraph Font"/>
     <w:uiPriority w:val="1"/>
-    <w:semiHidden/>
     <w:unhideWhenUsed/>
   </w:style>
   <w:style w:type="table" w:default="1" w:styleId="TableNormal">

</xml_diff>

<commit_message>
removed requirements 2.3.8, 2.3.10
</commit_message>
<xml_diff>
--- a/SRS_Communications.docx
+++ b/SRS_Communications.docx
@@ -771,7 +771,7 @@
                 <w:color w:val="000000" w:themeColor="text1"/>
                 <w:lang w:bidi="hi-IN"/>
               </w:rPr>
-              <w:t>Faniran-Ajiwe</w:t>
+              <w:t>Faniran</w:t>
             </w:r>
             <w:proofErr w:type="spellEnd"/>
             <w:r>
@@ -779,7 +779,7 @@
                 <w:color w:val="000000" w:themeColor="text1"/>
                 <w:lang w:bidi="hi-IN"/>
               </w:rPr>
-              <w:t xml:space="preserve"> </w:t>
+              <w:t xml:space="preserve">-Ajiwe </w:t>
             </w:r>
           </w:p>
           <w:p>
@@ -1180,6 +1180,13 @@
                 <w:u w:val="single"/>
               </w:rPr>
             </w:pPr>
+            <w:r>
+              <w:rPr>
+                <w:color w:val="000000"/>
+                <w:u w:val="single"/>
+              </w:rPr>
+              <w:t>03/13/2026</w:t>
+            </w:r>
           </w:p>
         </w:tc>
         <w:tc>
@@ -1200,6 +1207,12 @@
                 <w:color w:val="000000"/>
               </w:rPr>
             </w:pPr>
+            <w:r>
+              <w:rPr>
+                <w:color w:val="000000"/>
+              </w:rPr>
+              <w:t>1.51</w:t>
+            </w:r>
           </w:p>
         </w:tc>
         <w:tc>
@@ -1220,6 +1233,12 @@
                 <w:color w:val="000000"/>
               </w:rPr>
             </w:pPr>
+            <w:r>
+              <w:rPr>
+                <w:color w:val="000000"/>
+              </w:rPr>
+              <w:t>Use Case Diagrams (CA04-05)</w:t>
+            </w:r>
           </w:p>
         </w:tc>
         <w:tc>
@@ -1241,6 +1260,12 @@
                 <w:color w:val="000000"/>
               </w:rPr>
             </w:pPr>
+            <w:r>
+              <w:rPr>
+                <w:color w:val="000000"/>
+              </w:rPr>
+              <w:t>Darien, Victor</w:t>
+            </w:r>
           </w:p>
         </w:tc>
       </w:tr>
@@ -1264,6 +1289,13 @@
                 <w:u w:val="single"/>
               </w:rPr>
             </w:pPr>
+            <w:r>
+              <w:rPr>
+                <w:color w:val="000000"/>
+                <w:u w:val="single"/>
+              </w:rPr>
+              <w:t>04/18/2026</w:t>
+            </w:r>
           </w:p>
         </w:tc>
         <w:tc>
@@ -1284,6 +1316,12 @@
                 <w:color w:val="000000"/>
               </w:rPr>
             </w:pPr>
+            <w:r>
+              <w:rPr>
+                <w:color w:val="000000"/>
+              </w:rPr>
+              <w:t>1.6</w:t>
+            </w:r>
           </w:p>
         </w:tc>
         <w:tc>
@@ -1304,6 +1342,12 @@
                 <w:color w:val="000000"/>
               </w:rPr>
             </w:pPr>
+            <w:r>
+              <w:rPr>
+                <w:color w:val="000000"/>
+              </w:rPr>
+              <w:t>Requirements Revision</w:t>
+            </w:r>
           </w:p>
         </w:tc>
         <w:tc>
@@ -1325,6 +1369,12 @@
                 <w:color w:val="000000"/>
               </w:rPr>
             </w:pPr>
+            <w:r>
+              <w:rPr>
+                <w:color w:val="000000"/>
+              </w:rPr>
+              <w:t>Darien, Victor, Clarize</w:t>
+            </w:r>
           </w:p>
         </w:tc>
       </w:tr>
@@ -6115,29 +6165,10 @@
       </w:r>
       <w:r>
         <w:tab/>
-        <w:t>2.3.7</w:t>
-      </w:r>
-    </w:p>
-    <w:p>
-      <w:r>
-        <w:tab/>
-      </w:r>
-      <w:r>
-        <w:tab/>
-        <w:t xml:space="preserve">Help Page will cover the different client </w:t>
-      </w:r>
-      <w:r>
-        <w:t>capabilities.</w:t>
-      </w:r>
-    </w:p>
-    <w:p/>
-    <w:p>
-      <w:r>
-        <w:tab/>
-      </w:r>
-      <w:r>
-        <w:tab/>
-        <w:t>2.3.8</w:t>
+        <w:t>2.3.</w:t>
+      </w:r>
+      <w:r>
+        <w:t>7</w:t>
       </w:r>
     </w:p>
     <w:p>
@@ -6159,76 +6190,94 @@
         <w:ind w:left="1440"/>
       </w:pPr>
       <w:r>
-        <w:t>2.3.9</w:t>
-      </w:r>
-    </w:p>
-    <w:p>
-      <w:pPr>
-        <w:ind w:left="1440"/>
-      </w:pPr>
-      <w:r>
-        <w:t>Users are allowed to converse with another user or several at once.</w:t>
-      </w:r>
-    </w:p>
-    <w:p>
-      <w:pPr>
-        <w:ind w:left="1440"/>
-      </w:pPr>
-    </w:p>
-    <w:p>
-      <w:pPr>
-        <w:ind w:left="1440"/>
-      </w:pPr>
-      <w:r>
-        <w:t>2.3.10</w:t>
-      </w:r>
-    </w:p>
-    <w:p>
-      <w:pPr>
-        <w:ind w:left="1440"/>
-        <w:rPr>
-          <w:color w:val="000000" w:themeColor="text1"/>
-        </w:rPr>
-      </w:pPr>
-      <w:r>
-        <w:rPr>
-          <w:color w:val="000000" w:themeColor="text1"/>
-        </w:rPr>
-        <w:t xml:space="preserve">The message box supports conventional text modification, </w:t>
-      </w:r>
-      <w:r>
-        <w:rPr>
-          <w:color w:val="000000" w:themeColor="text1"/>
-        </w:rPr>
-        <w:t>i.e.,</w:t>
-      </w:r>
-      <w:r>
-        <w:rPr>
-          <w:color w:val="000000" w:themeColor="text1"/>
-        </w:rPr>
-        <w:t xml:space="preserve"> copy and paste, redo and undo.</w:t>
-      </w:r>
-    </w:p>
-    <w:p>
-      <w:pPr>
-        <w:ind w:left="1440"/>
-        <w:rPr>
-          <w:color w:val="000000" w:themeColor="text1"/>
-        </w:rPr>
-      </w:pPr>
-    </w:p>
-    <w:p>
-      <w:pPr>
-        <w:ind w:left="1440"/>
-        <w:rPr>
-          <w:color w:val="000000" w:themeColor="text1"/>
-        </w:rPr>
-      </w:pPr>
-      <w:r>
-        <w:rPr>
-          <w:color w:val="000000" w:themeColor="text1"/>
-        </w:rPr>
-        <w:t>2.3.11</w:t>
+        <w:t>2.3.</w:t>
+      </w:r>
+      <w:r>
+        <w:t>8</w:t>
+      </w:r>
+    </w:p>
+    <w:p>
+      <w:pPr>
+        <w:ind w:left="1440"/>
+      </w:pPr>
+      <w:r>
+        <w:t>Users can have several one-on-one chats with different users.</w:t>
+      </w:r>
+    </w:p>
+    <w:p>
+      <w:pPr>
+        <w:ind w:left="1440"/>
+      </w:pPr>
+    </w:p>
+    <w:p>
+      <w:pPr>
+        <w:ind w:left="1440"/>
+      </w:pPr>
+      <w:r>
+        <w:t>2.3.</w:t>
+      </w:r>
+      <w:r>
+        <w:t>9</w:t>
+      </w:r>
+    </w:p>
+    <w:p>
+      <w:pPr>
+        <w:ind w:left="1440"/>
+        <w:rPr>
+          <w:color w:val="000000" w:themeColor="text1"/>
+        </w:rPr>
+      </w:pPr>
+      <w:r>
+        <w:rPr>
+          <w:color w:val="000000" w:themeColor="text1"/>
+        </w:rPr>
+        <w:t xml:space="preserve">The </w:t>
+      </w:r>
+      <w:r>
+        <w:rPr>
+          <w:color w:val="000000" w:themeColor="text1"/>
+        </w:rPr>
+        <w:t>message box</w:t>
+      </w:r>
+      <w:r>
+        <w:rPr>
+          <w:color w:val="000000" w:themeColor="text1"/>
+        </w:rPr>
+        <w:t xml:space="preserve"> supports conventional text modification</w:t>
+      </w:r>
+      <w:r>
+        <w:rPr>
+          <w:color w:val="000000" w:themeColor="text1"/>
+        </w:rPr>
+        <w:t xml:space="preserve">, specifically copy, paste and select all. </w:t>
+      </w:r>
+    </w:p>
+    <w:p>
+      <w:pPr>
+        <w:ind w:left="1440"/>
+        <w:rPr>
+          <w:color w:val="000000" w:themeColor="text1"/>
+        </w:rPr>
+      </w:pPr>
+    </w:p>
+    <w:p>
+      <w:pPr>
+        <w:ind w:left="1440"/>
+        <w:rPr>
+          <w:color w:val="000000" w:themeColor="text1"/>
+        </w:rPr>
+      </w:pPr>
+      <w:r>
+        <w:rPr>
+          <w:color w:val="000000" w:themeColor="text1"/>
+        </w:rPr>
+        <w:t>2.3.1</w:t>
+      </w:r>
+      <w:r>
+        <w:rPr>
+          <w:color w:val="000000" w:themeColor="text1"/>
+        </w:rPr>
+        <w:t>0</w:t>
       </w:r>
     </w:p>
     <w:p>
@@ -6276,7 +6325,13 @@
         <w:rPr>
           <w:color w:val="000000" w:themeColor="text1"/>
         </w:rPr>
-        <w:t>2.3.12</w:t>
+        <w:t>2.3.1</w:t>
+      </w:r>
+      <w:r>
+        <w:rPr>
+          <w:color w:val="000000" w:themeColor="text1"/>
+        </w:rPr>
+        <w:t>1</w:t>
       </w:r>
     </w:p>
     <w:p>
@@ -6497,43 +6552,43 @@
         <w:rPr>
           <w:color w:val="000000" w:themeColor="text1"/>
         </w:rPr>
+        <w:t>The application’s soft deadline is 04/30/2026.</w:t>
+      </w:r>
+    </w:p>
+    <w:p>
+      <w:pPr>
+        <w:pStyle w:val="Paragraph2"/>
+        <w:rPr>
+          <w:color w:val="000000" w:themeColor="text1"/>
+        </w:rPr>
+      </w:pPr>
+    </w:p>
+    <w:p>
+      <w:pPr>
+        <w:pStyle w:val="Paragraph2"/>
+        <w:rPr>
+          <w:color w:val="000000" w:themeColor="text1"/>
+        </w:rPr>
+      </w:pPr>
+      <w:r>
+        <w:rPr>
+          <w:color w:val="000000" w:themeColor="text1"/>
+        </w:rPr>
+        <w:t>2.4.6</w:t>
+      </w:r>
+    </w:p>
+    <w:p>
+      <w:pPr>
+        <w:pStyle w:val="Paragraph2"/>
+        <w:rPr>
+          <w:color w:val="000000" w:themeColor="text1"/>
+        </w:rPr>
+      </w:pPr>
+      <w:r>
+        <w:rPr>
+          <w:color w:val="000000" w:themeColor="text1"/>
+        </w:rPr>
         <w:lastRenderedPageBreak/>
-        <w:t>The application’s soft deadline is 04/30/2026.</w:t>
-      </w:r>
-    </w:p>
-    <w:p>
-      <w:pPr>
-        <w:pStyle w:val="Paragraph2"/>
-        <w:rPr>
-          <w:color w:val="000000" w:themeColor="text1"/>
-        </w:rPr>
-      </w:pPr>
-    </w:p>
-    <w:p>
-      <w:pPr>
-        <w:pStyle w:val="Paragraph2"/>
-        <w:rPr>
-          <w:color w:val="000000" w:themeColor="text1"/>
-        </w:rPr>
-      </w:pPr>
-      <w:r>
-        <w:rPr>
-          <w:color w:val="000000" w:themeColor="text1"/>
-        </w:rPr>
-        <w:t>2.4.6</w:t>
-      </w:r>
-    </w:p>
-    <w:p>
-      <w:pPr>
-        <w:pStyle w:val="Paragraph2"/>
-        <w:rPr>
-          <w:color w:val="000000" w:themeColor="text1"/>
-        </w:rPr>
-      </w:pPr>
-      <w:r>
-        <w:rPr>
-          <w:color w:val="000000" w:themeColor="text1"/>
-        </w:rPr>
         <w:t xml:space="preserve">The application’s hard deadline is 05/05/2026. </w:t>
       </w:r>
     </w:p>
@@ -6985,31 +7040,31 @@
       </w:pPr>
       <w:bookmarkStart w:id="12" w:name="_Toc223255436"/>
       <w:r>
+        <w:t>Assumptions and Dependencies</w:t>
+      </w:r>
+      <w:bookmarkEnd w:id="12"/>
+    </w:p>
+    <w:p/>
+    <w:p>
+      <w:pPr>
+        <w:ind w:left="1440"/>
+      </w:pPr>
+      <w:r>
+        <w:t>2.5.1</w:t>
+      </w:r>
+    </w:p>
+    <w:p>
+      <w:pPr>
+        <w:pStyle w:val="Paragraph2"/>
+        <w:rPr>
+          <w:color w:val="000000" w:themeColor="text1"/>
+        </w:rPr>
+      </w:pPr>
+      <w:r>
+        <w:rPr>
+          <w:color w:val="000000" w:themeColor="text1"/>
+        </w:rPr>
         <w:lastRenderedPageBreak/>
-        <w:t>Assumptions and Dependencies</w:t>
-      </w:r>
-      <w:bookmarkEnd w:id="12"/>
-    </w:p>
-    <w:p/>
-    <w:p>
-      <w:pPr>
-        <w:ind w:left="1440"/>
-      </w:pPr>
-      <w:r>
-        <w:t>2.5.1</w:t>
-      </w:r>
-    </w:p>
-    <w:p>
-      <w:pPr>
-        <w:pStyle w:val="Paragraph2"/>
-        <w:rPr>
-          <w:color w:val="000000" w:themeColor="text1"/>
-        </w:rPr>
-      </w:pPr>
-      <w:r>
-        <w:rPr>
-          <w:color w:val="000000" w:themeColor="text1"/>
-        </w:rPr>
         <w:t xml:space="preserve">It is assumed that the application will handle </w:t>
       </w:r>
       <w:r>
@@ -7397,7 +7452,6 @@
         <w:rPr>
           <w:color w:val="000000" w:themeColor="text1"/>
         </w:rPr>
-        <w:lastRenderedPageBreak/>
         <w:t>It is assumed that future Java updates will maintain backward compatibility.</w:t>
       </w:r>
     </w:p>
@@ -7435,6 +7489,7 @@
         <w:rPr>
           <w:color w:val="000000" w:themeColor="text1"/>
         </w:rPr>
+        <w:lastRenderedPageBreak/>
         <w:t>The system does not depend on web servers, encryption libraries, and anything unmentioned.</w:t>
       </w:r>
     </w:p>
@@ -7814,7 +7869,7 @@
         <w:ind w:left="1440"/>
       </w:pPr>
       <w:r>
-        <w:t xml:space="preserve"> The system must gracefully handle network interruptions and notify users of disconnection.</w:t>
+        <w:t>The system must gracefully handle network interruptions and notify users of disconnection.</w:t>
       </w:r>
     </w:p>
     <w:p/>
@@ -10119,7 +10174,23 @@
           <w:rFonts w:eastAsia="Arial"/>
           <w:color w:val="000000" w:themeColor="text1"/>
         </w:rPr>
-        <w:t>3.1.1.4, 3.1.1.5, 3.1.1.12, 3.1.1.14, 3.1.2.3, 3.2.3, 3.3.10</w:t>
+        <w:t>3.1.1.4, 3.1.1.5, 3.1.1.12, 3.1.</w:t>
+      </w:r>
+      <w:proofErr w:type="gramStart"/>
+      <w:r>
+        <w:rPr>
+          <w:rFonts w:eastAsia="Arial"/>
+          <w:color w:val="000000" w:themeColor="text1"/>
+        </w:rPr>
+        <w:t>1.14</w:t>
+      </w:r>
+      <w:proofErr w:type="gramEnd"/>
+      <w:r>
+        <w:rPr>
+          <w:rFonts w:eastAsia="Arial"/>
+          <w:color w:val="000000" w:themeColor="text1"/>
+        </w:rPr>
+        <w:t>, 3.1.2.3, 3.2.3, 3.3.10</w:t>
       </w:r>
     </w:p>
     <w:p>
@@ -10575,7 +10646,23 @@
           <w:rFonts w:eastAsia="Arial"/>
           <w:color w:val="000000" w:themeColor="text1"/>
         </w:rPr>
-        <w:t>3.1.3.6 , 3.1.1.13, 3.1.2.4, 3.1.2.5, 3.1.3.6, 3.3.6</w:t>
+        <w:t>3.1.3.6 , 3.1.</w:t>
+      </w:r>
+      <w:proofErr w:type="gramStart"/>
+      <w:r>
+        <w:rPr>
+          <w:rFonts w:eastAsia="Arial"/>
+          <w:color w:val="000000" w:themeColor="text1"/>
+        </w:rPr>
+        <w:t>1.13</w:t>
+      </w:r>
+      <w:proofErr w:type="gramEnd"/>
+      <w:r>
+        <w:rPr>
+          <w:rFonts w:eastAsia="Arial"/>
+          <w:color w:val="000000" w:themeColor="text1"/>
+        </w:rPr>
+        <w:t>, 3.1.2.4, 3.1.2.5, 3.1.3.6, 3.3.6</w:t>
       </w:r>
     </w:p>
     <w:p>
@@ -12740,7 +12827,15 @@
         <w:ind w:left="1440"/>
       </w:pPr>
       <w:r>
-        <w:t>Relevant Requirements: 3.1.1.2, 3.1.1.3, 3.1.1.8, 3.1.3.2, 3.1.3.3, 3.1.3.3.1, 3.1.3.3.2, 3.1.3.4, 3.1.3.5, 3.1.4.1.2, 3.1.4.1.1, 3.2.2, 3.3.3.1, 3.3.4</w:t>
+        <w:t>Relevant Requirements: 3.1.1.2, 3.1.1.3, 3.1.1.8, 3.1.3.2, 3.1.3.3, 3.1.3.3</w:t>
+      </w:r>
+      <w:proofErr w:type="gramStart"/>
+      <w:r>
+        <w:t>.1, 3.1.3.3.2, 3.1.3.4</w:t>
+      </w:r>
+      <w:proofErr w:type="gramEnd"/>
+      <w:r>
+        <w:t>, 3.1.3.5, 3.1.4.1.2, 3.1.4.1.1, 3.2.2, 3.3.3.1, 3.3.4</w:t>
       </w:r>
     </w:p>
     <w:p>
@@ -20085,6 +20180,7 @@
   <w:style w:type="character" w:default="1" w:styleId="DefaultParagraphFont">
     <w:name w:val="Default Paragraph Font"/>
     <w:uiPriority w:val="1"/>
+    <w:semiHidden/>
     <w:unhideWhenUsed/>
   </w:style>
   <w:style w:type="table" w:default="1" w:styleId="TableNormal">

</xml_diff>